<commit_message>
Report and walkthrough: follow the audit fixes merged in PR #7
State that the gain over the historical average is in absolute error only (RMSE is slightly worse for demand), is seen on 13 of 14 test days, and that the bootstrap does not cover other weeks. Correct the validation diagnosis to match D12. Use the speaking split and AI disclosure now in the README; note that 17 April, the example day, is the one demand day the blend lost; mention that verify needs a git clone; link the team guides; 86 tests. DOCX and PDF rebuilt.

Co-Authored-By: Claude Opus 5.5 <noreply@anthropic.com>
Claude-Session: https://claude.ai/code/session_013bHKiVzmKY95kxUDyJv1Da
</commit_message>
<xml_diff>
--- a/reports/project_report/CS3011_Group52_Project_Report.docx
+++ b/reports/project_report/CS3011_Group52_Project_Report.docx
@@ -118,8 +118,8 @@
         <w:tblLook w:firstColumn="1" w:firstRow="1" w:lastColumn="0" w:lastRow="0" w:noHBand="0" w:noVBand="1" w:val="04A0"/>
       </w:tblPr>
       <w:tblGrid>
-        <w:gridCol w:w="4092"/>
-        <w:gridCol w:w="5091"/>
+        <w:gridCol w:w="3495"/>
+        <w:gridCol w:w="5689"/>
       </w:tblGrid>
       <w:tr>
         <w:trPr>
@@ -128,7 +128,7 @@
         </w:trPr>
         <w:tc>
           <w:tcPr>
-            <w:tcW w:type="dxa" w:w="4092"/>
+            <w:tcW w:type="dxa" w:w="3495"/>
             <w:shd w:val="clear" w:color="auto" w:fill="DCE3F0"/>
           </w:tcPr>
           <w:p>
@@ -147,7 +147,7 @@
         </w:tc>
         <w:tc>
           <w:tcPr>
-            <w:tcW w:type="dxa" w:w="5092"/>
+            <w:tcW w:type="dxa" w:w="5689"/>
             <w:shd w:val="clear" w:color="auto" w:fill="DCE3F0"/>
           </w:tcPr>
           <w:p>
@@ -160,7 +160,7 @@
                 <w:b/>
                 <w:sz w:val="19"/>
               </w:rPr>
-              <w:t>Planned module (project plan)</w:t>
+              <w:t>Presents and answers questions on (provisional)</w:t>
             </w:r>
           </w:p>
         </w:tc>
@@ -171,7 +171,7 @@
         </w:trPr>
         <w:tc>
           <w:tcPr>
-            <w:tcW w:type="dxa" w:w="4092"/>
+            <w:tcW w:type="dxa" w:w="3495"/>
           </w:tcPr>
           <w:p>
             <w:pPr>
@@ -189,7 +189,7 @@
         </w:tc>
         <w:tc>
           <w:tcPr>
-            <w:tcW w:type="dxa" w:w="5092"/>
+            <w:tcW w:type="dxa" w:w="5689"/>
           </w:tcPr>
           <w:p>
             <w:pPr>
@@ -201,7 +201,7 @@
                 <w:b w:val="0"/>
                 <w:sz w:val="19"/>
               </w:rPr>
-              <w:t>Architecture, demand model, integration</w:t>
+              <w:t>Framing, architecture, models and the blend decision</w:t>
             </w:r>
           </w:p>
         </w:tc>
@@ -212,7 +212,7 @@
         </w:trPr>
         <w:tc>
           <w:tcPr>
-            <w:tcW w:type="dxa" w:w="4092"/>
+            <w:tcW w:type="dxa" w:w="3495"/>
           </w:tcPr>
           <w:p>
             <w:pPr>
@@ -230,7 +230,7 @@
         </w:tc>
         <w:tc>
           <w:tcPr>
-            <w:tcW w:type="dxa" w:w="5092"/>
+            <w:tcW w:type="dxa" w:w="5689"/>
           </w:tcPr>
           <w:p>
             <w:pPr>
@@ -242,7 +242,7 @@
                 <w:b w:val="0"/>
                 <w:sz w:val="19"/>
               </w:rPr>
-              <w:t>Data pipeline</w:t>
+              <w:t>Data, licence, pipeline and quality rules</w:t>
             </w:r>
           </w:p>
         </w:tc>
@@ -253,7 +253,7 @@
         </w:trPr>
         <w:tc>
           <w:tcPr>
-            <w:tcW w:type="dxa" w:w="4092"/>
+            <w:tcW w:type="dxa" w:w="3495"/>
           </w:tcPr>
           <w:p>
             <w:pPr>
@@ -271,7 +271,7 @@
         </w:tc>
         <w:tc>
           <w:tcPr>
-            <w:tcW w:type="dxa" w:w="5092"/>
+            <w:tcW w:type="dxa" w:w="5689"/>
           </w:tcPr>
           <w:p>
             <w:pPr>
@@ -283,7 +283,7 @@
                 <w:b w:val="0"/>
                 <w:sz w:val="19"/>
               </w:rPr>
-              <w:t>Occupancy model and evaluation</w:t>
+              <w:t>Evaluation protocol, results and error analysis</w:t>
             </w:r>
           </w:p>
         </w:tc>
@@ -294,7 +294,7 @@
         </w:trPr>
         <w:tc>
           <w:tcPr>
-            <w:tcW w:type="dxa" w:w="4092"/>
+            <w:tcW w:type="dxa" w:w="3495"/>
           </w:tcPr>
           <w:p>
             <w:pPr>
@@ -312,7 +312,7 @@
         </w:tc>
         <w:tc>
           <w:tcPr>
-            <w:tcW w:type="dxa" w:w="5092"/>
+            <w:tcW w:type="dxa" w:w="5689"/>
           </w:tcPr>
           <w:p>
             <w:pPr>
@@ -324,7 +324,7 @@
                 <w:b w:val="0"/>
                 <w:sz w:val="19"/>
               </w:rPr>
-              <w:t>Streamlit dashboard</w:t>
+              <w:t>Dashboard demo and deployment</w:t>
             </w:r>
           </w:p>
         </w:tc>
@@ -335,7 +335,7 @@
         </w:trPr>
         <w:tc>
           <w:tcPr>
-            <w:tcW w:type="dxa" w:w="4092"/>
+            <w:tcW w:type="dxa" w:w="3495"/>
           </w:tcPr>
           <w:p>
             <w:pPr>
@@ -353,7 +353,7 @@
         </w:tc>
         <w:tc>
           <w:tcPr>
-            <w:tcW w:type="dxa" w:w="5092"/>
+            <w:tcW w:type="dxa" w:w="5689"/>
           </w:tcPr>
           <w:p>
             <w:pPr>
@@ -365,7 +365,7 @@
                 <w:b w:val="0"/>
                 <w:sz w:val="19"/>
               </w:rPr>
-              <w:t>Presentation and documentation</w:t>
+              <w:t>Crowding, capacity assumption and limitations</w:t>
             </w:r>
           </w:p>
         </w:tc>
@@ -667,7 +667,7 @@
         </w:rPr>
         <w:t>2.3 Licence</w:t>
         <w:tab/>
-        <w:t>6</w:t>
+        <w:t>7</w:t>
       </w:r>
     </w:p>
     <w:p>
@@ -1123,7 +1123,7 @@
         </w:rPr>
         <w:t>6.4 Error analysis</w:t>
         <w:tab/>
-        <w:t>15</w:t>
+        <w:t>16</w:t>
       </w:r>
     </w:p>
     <w:p>
@@ -1332,7 +1332,7 @@
         </w:rPr>
         <w:t>9.2 Reproducibility (measured)</w:t>
         <w:tab/>
-        <w:t>20</w:t>
+        <w:t>21</w:t>
       </w:r>
     </w:p>
     <w:p>
@@ -1582,7 +1582,7 @@
         <w:t xml:space="preserve"> </w:t>
       </w:r>
       <w:r>
-        <w:t xml:space="preserve">rule (23.67% and 25.39%), but only slightly better than a well-chosen historical average (18.35% and 19.35%; demand difference −0.20 points, 95% paired-bootstrap interval −0.29 to −0.06). Crowding levels for a 70-passenger bus reach a macro-F1 of 0.769, and between 0.683 and 0.772 across four capacity assumptions. Calibrated 80% prediction intervals cover 80.4% of test demand and 79.3% of test load, but only about 52% of night-time load values. The test weeks were scored twice, and both scorings are disclosed. Every number is produced by committed code; 85 automated tests and a verification command check that the results reproduce.</w:t>
+        <w:t xml:space="preserve">rule (23.67% and 25.39%), but only slightly better than a well-chosen historical average (18.35% and 19.35%; demand difference −0.20 points, 95% paired-bootstrap interval −0.29 to −0.06), and only in absolute error: on RMSE the historical average is slightly better for demand. Crowding levels for a 70-passenger bus reach a macro-F1 of 0.769, and between 0.683 and 0.772 across four capacity assumptions. Calibrated 80% prediction intervals cover 80.4% of test demand and 79.3% of test load, but only about 52% of night-time load values. The test weeks were scored twice, and both scorings are disclosed. Every number is produced by committed code; 86 automated tests and a verification command check that the results reproduce.</w:t>
       </w:r>
     </w:p>
     <w:p>
@@ -2104,7 +2104,7 @@
         <w:pStyle w:val="FirstParagraph"/>
       </w:pPr>
       <w:r>
-        <w:t xml:space="preserve">We needed open data with (i) passenger demand, (ii) some measure of how full vehicles are, (iii) at least several weeks of history, and (iv) a licence allowing reuse. Decision D1 in the repository records the comparison. Candidates included Victoria train counts, UrbanBus, TfNSW bus occupancy, TfL BUSTO, MTA hourly ridership, Trafiklab KoDa, Bengaluru metro (BMRCL) ridership and the repositories the team first collected (SUNT, the PMPML Pune GTFS generator, and an Aarhus University thesis repository). Timetable-only sources such as GTFS contain routes and schedules but no passenger counts, so they cannot provide training labels. The Indian sources we found had demand counts only (Bengaluru metro: hourly entries for about seven weeks) or nothing usable for tier-2 cities.</w:t>
+        <w:t xml:space="preserve">We needed open data with (i) passenger demand, (ii) some measure of how full vehicles are, (iii) at least several weeks of history, and (iv) a licence allowing reuse. Decision D1 in the repository records the comparison. Candidates included Victoria train counts, UrbanBus, TfNSW bus occupancy, TfL BUSTO, MTA hourly ridership, Trafiklab KoDa, Bengaluru metro (BMRCL) ridership and the repositories the team first collected (SUNT, the PMPML Pune GTFS generator, and an Aarhus University thesis repository). Timetable-only sources such as GTFS contain routes and schedules but no passenger counts, so they cannot provide training labels. The Indian sources we found had demand counts only (Bengaluru metro: hourly entries for about seven weeks) or nothing usable for tier-2 cities. The Ahmedabad–Gandhinagar dataset on Mendeley Data infers crowdedness from the smartphone sensors of a few commuters and has no route-level counts; the team read its description but did not inspect its files.</w:t>
       </w:r>
     </w:p>
     <w:p>
@@ -6706,13 +6706,13 @@
           <w:b/>
           <w:bCs/>
         </w:rPr>
-        <w:t xml:space="preserve">Diagnosis on validation only.</w:t>
-      </w:r>
-      <w:r>
-        <w:t xml:space="preserve"> </w:t>
-      </w:r>
-      <w:r>
-        <w:t xml:space="preserve">A history-length feature and a residual model on top of the historical average did not help on validation (</w:t>
+        <w:t xml:space="preserve">Diagnosis on validation only</w:t>
+      </w:r>
+      <w:r>
+        <w:t xml:space="preserve"> </w:t>
+      </w:r>
+      <w:r>
+        <w:t xml:space="preserve">(</w:t>
       </w:r>
       <w:r>
         <w:rPr>
@@ -6721,7 +6721,7 @@
         <w:t xml:space="preserve">reports/archive/experiments_validation_v2.csv</w:t>
       </w:r>
       <w:r>
-        <w:t xml:space="preserve">).</w:t>
+        <w:t xml:space="preserve">). A history-length feature made demand worse (19.14% to 19.16% validation WAPE, against 18.84% for LightGBM alone). For demand, a model of the residual from the historical average was slightly better than LightGBM alone (18.69% to 18.82%), but it stopped after 11–31 boosting rounds, a sign that little signal remains beyond the weekly profile, and the simpler blend did better still (18.65%).</w:t>
       </w:r>
     </w:p>
     <w:p>
@@ -10620,7 +10620,7 @@
         <w:t xml:space="preserve">small</w:t>
       </w:r>
       <w:r>
-        <w:t xml:space="preserve">: 0.20 WAPE points for demand. The interval excludes zero, so the gain is consistent across routes, but it is too small to matter much in practice.</w:t>
+        <w:t xml:space="preserve">: 0.20 WAPE points for demand. The interval excludes zero, and the final forecast has the lower WAPE on 13 of the 14 test days for demand (12 of 14 for estimated load), so the gain is consistent; but it is too small to matter much in practice. It is also a gain in absolute error only: the model was tuned on absolute error, and on RMSE, which weights large errors more, the historical average is slightly better for demand (29.58 against 29.72; for load the final forecast is better, 6.90 against 6.96).</w:t>
       </w:r>
     </w:p>
     <w:p>
@@ -10628,7 +10628,7 @@
         <w:pStyle w:val="BodyText"/>
       </w:pPr>
       <w:r>
-        <w:t xml:space="preserve">The ablation and the feature importances explain why. Almost all of the model’s skill comes from same-hour history, and a single feature, the historical average itself, carries more than 70% of the gain. Bus demand in Salvador in these weeks is dominated by a stable weekly profile per route and hour; once that profile is known, there is little left for a model to learn from the features we have. LightGBM alone did not beat the historical average on test. We report this as a finding rather than hiding it: a well-chosen simple baseline is hard to beat for hourly route demand, and claims of large ML gains should always be checked against one. Note also that these intervals measure variation across routes; they do not cover the extra uncertainty from the test weeks having been scored twice.</w:t>
+        <w:t xml:space="preserve">The ablation and the feature importances explain why. Almost all of the model’s skill comes from same-hour history, and a single feature, the historical average itself, carries more than 70% of the gain. Bus demand in Salvador in these weeks is dominated by a stable weekly profile per route and hour; once that profile is known, there is little left for a model to learn from the features we have. LightGBM alone did not beat the historical average on test. We report this as a finding rather than hiding it: a well-chosen simple baseline is hard to beat for hourly route demand, and claims of large ML gains should always be checked against one. Note also that the bootstrap resamples route-directions within the same 14 test days: its interval does not cover week-to-week or seasonal variation, nor the extra uncertainty from the test weeks having been scored twice.</w:t>
       </w:r>
     </w:p>
     <w:bookmarkEnd w:id="58"/>
@@ -12334,7 +12334,7 @@
         <w:pStyle w:val="BodyText"/>
       </w:pPr>
       <w:r>
-        <w:t xml:space="preserve">Figure 5 shows one day of the busiest route-direction in the test weeks. Both forecasts follow the daily shape closely outside the morning peak. In the 06:00–08:00 peak the final forecast stays well below the actual values, while the last-week rule happens to be closer on this day. A single day cannot show which method is better overall; Tables 1 and 6 do that. The figure shows the typical shape and that the blend is conservative at the highest peaks.</w:t>
+        <w:t xml:space="preserve">Figure 5 shows one day of the busiest route-direction in the test weeks. Both forecasts follow the daily shape closely outside the morning peak. In the 06:00–08:00 peak the final forecast stays well below the actual values, while the last-week rule happens to be closer on this day. The example is chosen by a fixed rule in the report generator (the busiest route-direction, on the first test Wednesday), not picked to flatter the model, and it happens to be unfavourable: 17 April is the only test day on which the final forecast’s demand WAPE was higher than the historical average’s (16.74% against 16.59%). A single day cannot show which method is better overall; Tables 1 and 6 do that. The figure shows the typical shape and that the blend is conservative at the highest peaks.</w:t>
       </w:r>
     </w:p>
     <w:bookmarkEnd w:id="68"/>
@@ -14167,7 +14167,7 @@
         <w:spacing w:before="160"/>
       </w:pPr>
       <w:r>
-        <w:t xml:space="preserve">For a daily list of 50 hours, 92.1% of the flagged hours were genuinely high crowding, against 78.6% with the last-week rule. The final forecast and the historical average are again close.</w:t>
+        <w:t xml:space="preserve">For a daily list of 50 hours, 92.1% of the flagged hours were genuinely high crowding, against 78.6% with the last-week rule. The final forecast and the historical average are again close: their precision differs by at most 2.0 percentage points at K = 25, 50 or 100. The clear gain is over the last-week rule.</w:t>
       </w:r>
     </w:p>
     <w:bookmarkEnd w:id="75"/>
@@ -15949,7 +15949,7 @@
         <w:rPr>
           <w:rStyle w:val="VerbatimChar"/>
         </w:rPr>
-        <w:t xml:space="preserve">pytest                            # 85 tests</w:t>
+        <w:t xml:space="preserve">pytest                            # 86 tests</w:t>
       </w:r>
     </w:p>
     <w:bookmarkEnd w:id="81"/>
@@ -16092,7 +16092,7 @@
         <w:t xml:space="preserve"> </w:t>
       </w:r>
       <w:r>
-        <w:t xml:space="preserve">with the committed file (relative tolerance 10⁻⁶; run times ignored).</w:t>
+        <w:t xml:space="preserve">with the committed file (relative tolerance 10⁻⁶; run times ignored). It needs a git clone (not a ZIP download), because it compares against the files committed in git.</w:t>
       </w:r>
     </w:p>
     <w:p>
@@ -16160,7 +16160,7 @@
         <w:keepNext/>
       </w:pPr>
       <w:r>
-        <w:t xml:space="preserve">There are 85 automated tests (pytest). GitHub Actions runs them, followed by</w:t>
+        <w:t xml:space="preserve">There are 86 automated tests (pytest). GitHub Actions runs them, followed by</w:t>
       </w:r>
       <w:r>
         <w:t xml:space="preserve"> </w:t>
@@ -16198,10 +16198,10 @@
         <w:tblLook w:firstRow="1" w:lastRow="0" w:firstColumn="0" w:lastColumn="0" w:noHBand="0" w:noVBand="0" w:val="0020"/>
       </w:tblPr>
       <w:tblGrid>
-        <w:gridCol w:w="1860"/>
+        <w:gridCol w:w="1847"/>
         <w:gridCol w:w="3600"/>
         <w:gridCol w:w="765"/>
-        <w:gridCol w:w="2958"/>
+        <w:gridCol w:w="2971"/>
       </w:tblGrid>
       <w:tr>
         <w:trPr>
@@ -16211,7 +16211,7 @@
         </w:trPr>
         <w:tc>
           <w:tcPr>
-            <w:tcW w:type="dxa" w:w="1861"/>
+            <w:tcW w:type="dxa" w:w="1848"/>
             <w:shd w:val="clear" w:color="auto" w:fill="DCE3F0"/>
           </w:tcPr>
           <w:p>
@@ -16271,7 +16271,7 @@
         </w:tc>
         <w:tc>
           <w:tcPr>
-            <w:tcW w:type="dxa" w:w="2958"/>
+            <w:tcW w:type="dxa" w:w="2971"/>
             <w:shd w:val="clear" w:color="auto" w:fill="DCE3F0"/>
           </w:tcPr>
           <w:p>
@@ -16296,7 +16296,7 @@
         </w:trPr>
         <w:tc>
           <w:tcPr>
-            <w:tcW w:type="dxa" w:w="1861"/>
+            <w:tcW w:type="dxa" w:w="1848"/>
           </w:tcPr>
           <w:p>
             <w:pPr>
@@ -16351,7 +16351,7 @@
         </w:tc>
         <w:tc>
           <w:tcPr>
-            <w:tcW w:type="dxa" w:w="2958"/>
+            <w:tcW w:type="dxa" w:w="2971"/>
           </w:tcPr>
           <w:p>
             <w:pPr>
@@ -16374,7 +16374,7 @@
         </w:trPr>
         <w:tc>
           <w:tcPr>
-            <w:tcW w:type="dxa" w:w="1861"/>
+            <w:tcW w:type="dxa" w:w="1848"/>
           </w:tcPr>
           <w:p>
             <w:pPr>
@@ -16429,7 +16429,7 @@
         </w:tc>
         <w:tc>
           <w:tcPr>
-            <w:tcW w:type="dxa" w:w="2958"/>
+            <w:tcW w:type="dxa" w:w="2971"/>
           </w:tcPr>
           <w:p>
             <w:pPr>
@@ -16452,7 +16452,7 @@
         </w:trPr>
         <w:tc>
           <w:tcPr>
-            <w:tcW w:type="dxa" w:w="1861"/>
+            <w:tcW w:type="dxa" w:w="1848"/>
           </w:tcPr>
           <w:p>
             <w:pPr>
@@ -16507,7 +16507,7 @@
         </w:tc>
         <w:tc>
           <w:tcPr>
-            <w:tcW w:type="dxa" w:w="2958"/>
+            <w:tcW w:type="dxa" w:w="2971"/>
           </w:tcPr>
           <w:p>
             <w:pPr>
@@ -16530,7 +16530,7 @@
         </w:trPr>
         <w:tc>
           <w:tcPr>
-            <w:tcW w:type="dxa" w:w="1861"/>
+            <w:tcW w:type="dxa" w:w="1848"/>
           </w:tcPr>
           <w:p>
             <w:pPr>
@@ -16585,7 +16585,7 @@
         </w:tc>
         <w:tc>
           <w:tcPr>
-            <w:tcW w:type="dxa" w:w="2958"/>
+            <w:tcW w:type="dxa" w:w="2971"/>
           </w:tcPr>
           <w:p>
             <w:pPr>
@@ -16608,7 +16608,7 @@
         </w:trPr>
         <w:tc>
           <w:tcPr>
-            <w:tcW w:type="dxa" w:w="1861"/>
+            <w:tcW w:type="dxa" w:w="1848"/>
           </w:tcPr>
           <w:p>
             <w:pPr>
@@ -16663,7 +16663,7 @@
         </w:tc>
         <w:tc>
           <w:tcPr>
-            <w:tcW w:type="dxa" w:w="2958"/>
+            <w:tcW w:type="dxa" w:w="2971"/>
           </w:tcPr>
           <w:p>
             <w:pPr>
@@ -16686,7 +16686,7 @@
         </w:trPr>
         <w:tc>
           <w:tcPr>
-            <w:tcW w:type="dxa" w:w="1861"/>
+            <w:tcW w:type="dxa" w:w="1848"/>
           </w:tcPr>
           <w:p>
             <w:pPr>
@@ -16741,7 +16741,7 @@
         </w:tc>
         <w:tc>
           <w:tcPr>
-            <w:tcW w:type="dxa" w:w="2958"/>
+            <w:tcW w:type="dxa" w:w="2971"/>
           </w:tcPr>
           <w:p>
             <w:pPr>
@@ -16764,7 +16764,7 @@
         </w:trPr>
         <w:tc>
           <w:tcPr>
-            <w:tcW w:type="dxa" w:w="1861"/>
+            <w:tcW w:type="dxa" w:w="1848"/>
           </w:tcPr>
           <w:p>
             <w:pPr>
@@ -16819,7 +16819,7 @@
         </w:tc>
         <w:tc>
           <w:tcPr>
-            <w:tcW w:type="dxa" w:w="2958"/>
+            <w:tcW w:type="dxa" w:w="2971"/>
           </w:tcPr>
           <w:p>
             <w:pPr>
@@ -16850,7 +16850,7 @@
         </w:trPr>
         <w:tc>
           <w:tcPr>
-            <w:tcW w:type="dxa" w:w="1861"/>
+            <w:tcW w:type="dxa" w:w="1848"/>
           </w:tcPr>
           <w:p>
             <w:pPr>
@@ -16905,7 +16905,7 @@
         </w:tc>
         <w:tc>
           <w:tcPr>
-            <w:tcW w:type="dxa" w:w="2958"/>
+            <w:tcW w:type="dxa" w:w="2971"/>
           </w:tcPr>
           <w:p>
             <w:pPr>
@@ -16928,7 +16928,7 @@
         </w:trPr>
         <w:tc>
           <w:tcPr>
-            <w:tcW w:type="dxa" w:w="1861"/>
+            <w:tcW w:type="dxa" w:w="1848"/>
           </w:tcPr>
           <w:p>
             <w:pPr>
@@ -16983,7 +16983,7 @@
         </w:tc>
         <w:tc>
           <w:tcPr>
-            <w:tcW w:type="dxa" w:w="2958"/>
+            <w:tcW w:type="dxa" w:w="2971"/>
           </w:tcPr>
           <w:p>
             <w:pPr>
@@ -17006,7 +17006,7 @@
         </w:trPr>
         <w:tc>
           <w:tcPr>
-            <w:tcW w:type="dxa" w:w="1861"/>
+            <w:tcW w:type="dxa" w:w="1848"/>
           </w:tcPr>
           <w:p>
             <w:pPr>
@@ -17055,13 +17055,13 @@
               <w:rPr>
                 <w:sz w:val="19"/>
               </w:rPr>
-              <w:t xml:space="preserve">6</w:t>
-            </w:r>
-          </w:p>
-        </w:tc>
-        <w:tc>
-          <w:tcPr>
-            <w:tcW w:type="dxa" w:w="2958"/>
+              <w:t xml:space="preserve">7</w:t>
+            </w:r>
+          </w:p>
+        </w:tc>
+        <w:tc>
+          <w:tcPr>
+            <w:tcW w:type="dxa" w:w="2971"/>
           </w:tcPr>
           <w:p>
             <w:pPr>
@@ -17087,6 +17087,12 @@
                 <w:sz w:val="19"/>
               </w:rPr>
               <w:t xml:space="preserve">transit.verify</w:t>
+            </w:r>
+            <w:r>
+              <w:rPr>
+                <w:sz w:val="19"/>
+              </w:rPr>
+              <w:t xml:space="preserve">, and a clear message when git is missing</w:t>
             </w:r>
           </w:p>
         </w:tc>
@@ -17098,7 +17104,7 @@
         <w:spacing w:before="160"/>
       </w:pPr>
       <w:r>
-        <w:t xml:space="preserve">On 24 October 2026 the suite passed (85 passed) and</w:t>
+        <w:t xml:space="preserve">On 24 October 2026 the suite passed (86 passed) and</w:t>
       </w:r>
       <w:r>
         <w:t xml:space="preserve"> </w:t>
@@ -17512,7 +17518,7 @@
         <w:t xml:space="preserve"> </w:t>
       </w:r>
       <w:r>
-        <w:t xml:space="preserve">The model’s advantage over the historical average is 0.20 WAPE points for demand.</w:t>
+        <w:t xml:space="preserve">The model’s advantage over the historical average is 0.20 WAPE points for demand, in absolute error only (on RMSE the historical average is slightly better for demand). The bootstrap interval covers variation across routes within the 14 test days, not across weeks or seasons.</w:t>
       </w:r>
     </w:p>
     <w:p>
@@ -17800,7 +17806,7 @@
         <w:t xml:space="preserve"> </w:t>
       </w:r>
       <w:r>
-        <w:t xml:space="preserve">Parts of the code and documentation, including drafts of this report, were produced in AI-assisted sessions (Claude, Anthropic) directed by the team lead; commits that include such work carry a</w:t>
+        <w:t xml:space="preserve">The code and documents in the repository, including this report, were written in AI-assisted sessions with Claude (Anthropic), directed and reviewed by the group lead. Every such commit carries a</w:t>
       </w:r>
       <w:r>
         <w:t xml:space="preserve"> </w:t>
@@ -17815,7 +17821,7 @@
         <w:t xml:space="preserve"> </w:t>
       </w:r>
       <w:r>
-        <w:t xml:space="preserve">line. The team remains responsible for the content and must be able to explain it.</w:t>
+        <w:t xml:space="preserve">line; as of 24 October 2026 that is every commit. The team remains responsible for the content and must be able to explain it.</w:t>
       </w:r>
     </w:p>
     <w:bookmarkEnd w:id="90"/>
@@ -18066,7 +18072,7 @@
         <w:t xml:space="preserve"> </w:t>
       </w:r>
       <w:r>
-        <w:t xml:space="preserve">rule, but only marginally better than a well-chosen historical average. Crowding levels for a standard bus reach a macro-F1 of 0.769, and a daily list of the 50 most crowded forecast hours is right 92.1% of the time.</w:t>
+        <w:t xml:space="preserve">rule, but only marginally better than a well-chosen historical average, and only in absolute error. Crowding levels for a standard bus reach a macro-F1 of 0.769, and a daily list of the 50 most crowded forecast hours is right 92.1% of the time.</w:t>
       </w:r>
     </w:p>
     <w:p>
@@ -18440,7 +18446,10 @@
         <w:pStyle w:val="FirstParagraph"/>
       </w:pPr>
       <w:r>
-        <w:t xml:space="preserve">The module ownership on the title page is the plan recorded in the repository (</w:t>
+        <w:t xml:space="preserve">The table on the title page is the provisional speaking split for the presentation and viva, as recorded in</w:t>
+      </w:r>
+      <w:r>
+        <w:t xml:space="preserve"> </w:t>
       </w:r>
       <w:r>
         <w:rPr>
@@ -18449,7 +18458,10 @@
         <w:t xml:space="preserve">README.md</w:t>
       </w:r>
       <w:r>
-        <w:t xml:space="preserve">,</w:t>
+        <w:t xml:space="preserve"> </w:t>
+      </w:r>
+      <w:r>
+        <w:t xml:space="preserve">and</w:t>
       </w:r>
       <w:r>
         <w:t xml:space="preserve"> </w:t>
@@ -18458,10 +18470,18 @@
         <w:rPr>
           <w:rStyle w:val="VerbatimChar"/>
         </w:rPr>
-        <w:t xml:space="preserve">docs/PROJECT_PLAN.md</w:t>
-      </w:r>
-      <w:r>
-        <w:t xml:space="preserve">); the plan states that it may change. The presentation responsibilities proposed in</w:t>
+        <w:t xml:space="preserve">docs/TEAM_PRESENTATION_GUIDE.md</w:t>
+      </w:r>
+      <w:r>
+        <w:t xml:space="preserve">. It is not a record of who wrote which code.</w:t>
+      </w:r>
+    </w:p>
+    <w:p>
+      <w:pPr>
+        <w:pStyle w:val="BodyText"/>
+      </w:pPr>
+      <w:r>
+        <w:t xml:space="preserve">As recorded in the repository, the code and documents were written in AI-assisted sessions with Claude (Anthropic), directed and reviewed by the group lead, and every commit up to 24 October 2026 carries a</w:t>
       </w:r>
       <w:r>
         <w:t xml:space="preserve"> </w:t>
@@ -18470,21 +18490,13 @@
         <w:rPr>
           <w:rStyle w:val="VerbatimChar"/>
         </w:rPr>
-        <w:t xml:space="preserve">docs/VIVA_PREP.md</w:t>
-      </w:r>
-      <w:r>
-        <w:t xml:space="preserve"> </w:t>
-      </w:r>
-      <w:r>
-        <w:t xml:space="preserve">are: Jay, problem framing, architecture and the model and blend decision; Akshar, data, licence, pipeline, quality checks and missing hours; Tirth, evaluation protocol, baselines, metrics, bootstrap and error analysis; Disha, dashboard walkthrough, deployment and local fallback; Shivani, crowding and capacity assumption, limitations and future work.</w:t>
-      </w:r>
-    </w:p>
-    <w:p>
-      <w:pPr>
-        <w:pStyle w:val="BodyText"/>
-      </w:pPr>
-      <w:r>
-        <w:t xml:space="preserve">As recorded in the project plan, the pipeline, models, dashboard and documents were built in AI-assisted sessions directed by the group lead. Teammates’ own reviews, runs and edits are to be committed from their own accounts, so that the Git history shows each contribution. This report does not claim individual contributions beyond what the repository records.</w:t>
+        <w:t xml:space="preserve">Co-Authored-By</w:t>
+      </w:r>
+      <w:r>
+        <w:t xml:space="preserve"> </w:t>
+      </w:r>
+      <w:r>
+        <w:t xml:space="preserve">line. Teammates’ own reviews, runs and edits are to be committed from their own accounts, so that the Git history shows each contribution. This report does not claim individual contributions beyond what the repository records.</w:t>
       </w:r>
     </w:p>
     <w:bookmarkEnd w:id="100"/>

</xml_diff>

<commit_message>
Report and walkthrough: describe the GitHub Pages deployment; rebuild exports
- Report section 9.5 'Public deployment (GitHub Pages)': how it is
  published and loaded, what was checked on 24 Oct (published files
  byte-identical to main; all five pages in a real browser matching the
  local app) and measured load times (cold 83 s at 10 Mbit/s and 340 s
  at 2 Mbit/s; repeat visits about 40 s). Limitation 11, future work
  and the conclusion no longer say the dashboard is undeployed.
- Test counts 86 -> 93 (tests/test_web.py added), with its table row.
- Walkthrough: public copy of the dashboard, web/ files and the pages
  workflow; Disha's fallback answer updated.
- DOCX and PDF rebuilt with build_report.py (28 pages); the new section
  was checked in the rendered PDF.

No metric, prediction or results file changed.

Co-Authored-By: Claude Opus 5.5 <noreply@anthropic.com>
Claude-Session: https://claude.ai/code/session_01BNmSxnJkkJYvHPob8z9Rs7
</commit_message>
<xml_diff>
--- a/reports/project_report/CS3011_Group52_Project_Report.docx
+++ b/reports/project_report/CS3011_Group52_Project_Report.docx
@@ -1378,18 +1378,18 @@
         <w:tabs>
           <w:tab w:pos="9184" w:val="right" w:leader="dot"/>
         </w:tabs>
-        <w:spacing w:after="60" w:before="100"/>
-        <w:ind w:left="0"/>
+        <w:spacing w:after="20" w:before="0"/>
+        <w:ind w:left="340"/>
       </w:pPr>
       <w:r>
         <w:rPr>
           <w:rFonts w:ascii="Calibri" w:hAnsi="Calibri"/>
-          <w:b/>
-          <w:sz w:val="21"/>
-        </w:rPr>
-        <w:t>10. Limitations</w:t>
+          <w:b w:val="0"/>
+          <w:sz w:val="20"/>
+        </w:rPr>
+        <w:t>9.5 Public deployment (GitHub Pages)</w:t>
         <w:tab/>
-        <w:t>24</w:t>
+        <w:t>23</w:t>
       </w:r>
     </w:p>
     <w:p>
@@ -1406,7 +1406,7 @@
           <w:b/>
           <w:sz w:val="21"/>
         </w:rPr>
-        <w:t>11. Ethical considerations</w:t>
+        <w:t>10. Limitations</w:t>
         <w:tab/>
         <w:t>24</w:t>
       </w:r>
@@ -1425,7 +1425,7 @@
           <w:b/>
           <w:sz w:val="21"/>
         </w:rPr>
-        <w:t>12. Future work (proposed; none of this has been done)</w:t>
+        <w:t>11. Ethical considerations</w:t>
         <w:tab/>
         <w:t>25</w:t>
       </w:r>
@@ -1444,9 +1444,9 @@
           <w:b/>
           <w:sz w:val="21"/>
         </w:rPr>
-        <w:t>13. Conclusion</w:t>
+        <w:t>12. Future work (proposed; none of this has been done)</w:t>
         <w:tab/>
-        <w:t>25</w:t>
+        <w:t>26</w:t>
       </w:r>
     </w:p>
     <w:p>
@@ -1463,7 +1463,7 @@
           <w:b/>
           <w:sz w:val="21"/>
         </w:rPr>
-        <w:t>References</w:t>
+        <w:t>13. Conclusion</w:t>
         <w:tab/>
         <w:t>26</w:t>
       </w:r>
@@ -1482,7 +1482,7 @@
           <w:b/>
           <w:sz w:val="21"/>
         </w:rPr>
-        <w:t>Appendix A. Team and contributions</w:t>
+        <w:t>References</w:t>
         <w:tab/>
         <w:t>27</w:t>
       </w:r>
@@ -1501,9 +1501,28 @@
           <w:b/>
           <w:sz w:val="21"/>
         </w:rPr>
+        <w:t>Appendix A. Team and contributions</w:t>
+        <w:tab/>
+        <w:t>28</w:t>
+      </w:r>
+    </w:p>
+    <w:p>
+      <w:pPr>
+        <w:tabs>
+          <w:tab w:pos="9184" w:val="right" w:leader="dot"/>
+        </w:tabs>
+        <w:spacing w:after="60" w:before="100"/>
+        <w:ind w:left="0"/>
+      </w:pPr>
+      <w:r>
+        <w:rPr>
+          <w:rFonts w:ascii="Calibri" w:hAnsi="Calibri"/>
+          <w:b/>
+          <w:sz w:val="21"/>
+        </w:rPr>
         <w:t>Appendix B. Decision log index</w:t>
         <w:tab/>
-        <w:t>27</w:t>
+        <w:t>28</w:t>
       </w:r>
       <w:r>
         <w:fldChar w:fldCharType="end"/>
@@ -15736,7 +15755,7 @@
     </w:p>
     <w:bookmarkEnd w:id="79"/>
     <w:bookmarkEnd w:id="80"/>
-    <w:bookmarkStart w:id="88" w:name="Xddcff86c0f61894e04f838b1444659ba2822bd5"/>
+    <w:bookmarkStart w:id="89" w:name="Xddcff86c0f61894e04f838b1444659ba2822bd5"/>
     <w:p>
       <w:pPr>
         <w:pStyle w:val="Heading1"/>
@@ -15949,7 +15968,7 @@
         <w:rPr>
           <w:rStyle w:val="VerbatimChar"/>
         </w:rPr>
-        <w:t xml:space="preserve">pytest                            # 86 tests</w:t>
+        <w:t xml:space="preserve">pytest                            # 93 tests</w:t>
       </w:r>
     </w:p>
     <w:bookmarkEnd w:id="81"/>
@@ -16160,7 +16179,7 @@
         <w:keepNext/>
       </w:pPr>
       <w:r>
-        <w:t xml:space="preserve">There are 86 automated tests (pytest). GitHub Actions runs them, followed by</w:t>
+        <w:t xml:space="preserve">There are 93 automated tests (pytest). GitHub Actions runs them, followed by</w:t>
       </w:r>
       <w:r>
         <w:t xml:space="preserve"> </w:t>
@@ -17097,6 +17116,84 @@
           </w:p>
         </w:tc>
       </w:tr>
+      <w:tr>
+        <w:trPr>
+          <w:cantSplit/>
+        </w:trPr>
+        <w:tc>
+          <w:tcPr>
+            <w:tcW w:type="dxa" w:w="1848"/>
+          </w:tcPr>
+          <w:p>
+            <w:pPr>
+              <w:pStyle w:val="Compact"/>
+              <w:spacing w:after="0" w:before="0" w:line="240" w:lineRule="auto"/>
+              <w:jc w:val="left"/>
+            </w:pPr>
+            <w:r>
+              <w:rPr>
+                <w:sz w:val="19"/>
+              </w:rPr>
+              <w:t xml:space="preserve">Public web build</w:t>
+            </w:r>
+          </w:p>
+        </w:tc>
+        <w:tc>
+          <w:tcPr>
+            <w:tcW w:type="dxa" w:w="3600"/>
+          </w:tcPr>
+          <w:p>
+            <w:pPr>
+              <w:pStyle w:val="Compact"/>
+              <w:spacing w:after="0" w:before="0" w:line="240" w:lineRule="auto"/>
+              <w:jc w:val="left"/>
+            </w:pPr>
+            <w:r>
+              <w:rPr>
+                <w:rStyle w:val="VerbatimChar"/>
+                <w:sz w:val="19"/>
+              </w:rPr>
+              <w:t xml:space="preserve">test_web.py</w:t>
+            </w:r>
+          </w:p>
+        </w:tc>
+        <w:tc>
+          <w:tcPr>
+            <w:tcW w:type="dxa" w:w="765"/>
+          </w:tcPr>
+          <w:p>
+            <w:pPr>
+              <w:pStyle w:val="Compact"/>
+              <w:spacing w:after="0" w:before="0" w:line="240" w:lineRule="auto"/>
+              <w:jc w:val="left"/>
+            </w:pPr>
+            <w:r>
+              <w:rPr>
+                <w:sz w:val="19"/>
+              </w:rPr>
+              <w:t xml:space="preserve">7</w:t>
+            </w:r>
+          </w:p>
+        </w:tc>
+        <w:tc>
+          <w:tcPr>
+            <w:tcW w:type="dxa" w:w="2971"/>
+          </w:tcPr>
+          <w:p>
+            <w:pPr>
+              <w:pStyle w:val="Compact"/>
+              <w:spacing w:after="0" w:before="0" w:line="240" w:lineRule="auto"/>
+              <w:jc w:val="left"/>
+            </w:pPr>
+            <w:r>
+              <w:rPr>
+                <w:sz w:val="19"/>
+              </w:rPr>
+              <w:t xml:space="preserve">the web page lists every module and data file the app reads; the site build copies them byte for byte with a SHA-256 manifest; versions are pinned; the app does not load scikit-learn</w:t>
+            </w:r>
+          </w:p>
+        </w:tc>
+      </w:tr>
     </w:tbl>
     <w:p>
       <w:pPr>
@@ -17104,7 +17201,7 @@
         <w:spacing w:before="160"/>
       </w:pPr>
       <w:r>
-        <w:t xml:space="preserve">On 24 October 2026 the suite passed (86 passed) and</w:t>
+        <w:t xml:space="preserve">On 24 October 2026 the suite passed (93 passed) and</w:t>
       </w:r>
       <w:r>
         <w:t xml:space="preserve"> </w:t>
@@ -17322,49 +17419,59 @@
         <w:t xml:space="preserve">Changing the capacity on the explorer page does not re-run any model; it only moves the threshold lines and relabels the crowding strip. Every page is checked by an automated test that fails on any exception.</w:t>
       </w:r>
     </w:p>
-    <w:p>
-      <w:pPr>
-        <w:pStyle w:val="BodyText"/>
-      </w:pPr>
+    <w:bookmarkEnd w:id="87"/>
+    <w:bookmarkStart w:id="88" w:name="public-deployment-github-pages"/>
+    <w:p>
+      <w:pPr>
+        <w:pStyle w:val="Heading2"/>
+      </w:pPr>
+      <w:r>
+        <w:t xml:space="preserve">9.5 Public deployment (GitHub Pages)</w:t>
+      </w:r>
+    </w:p>
+    <w:p>
+      <w:pPr>
+        <w:pStyle w:val="FirstParagraph"/>
+      </w:pPr>
+      <w:r>
+        <w:t xml:space="preserve">The same dashboard is public at</w:t>
+      </w:r>
+      <w:r>
+        <w:t xml:space="preserve"> </w:t>
+      </w:r>
       <w:r>
         <w:rPr>
           <w:b/>
           <w:bCs/>
         </w:rPr>
-        <w:t xml:space="preserve">Deployment status:</w:t>
-      </w:r>
-      <w:r>
-        <w:t xml:space="preserve"> </w:t>
-      </w:r>
-      <w:r>
-        <w:t xml:space="preserve">the dashboard runs locally. It</w:t>
-      </w:r>
-      <w:r>
-        <w:t xml:space="preserve"> </w:t>
-      </w:r>
-      <w:r>
-        <w:rPr>
-          <w:b/>
-          <w:bCs/>
-        </w:rPr>
-        <w:t xml:space="preserve">has not been deployed</w:t>
-      </w:r>
-      <w:r>
-        <w:t xml:space="preserve"> </w:t>
-      </w:r>
-      <w:r>
-        <w:t xml:space="preserve">to Streamlit Community Cloud at the time of writing. If it is deployed before the evaluation, the deployment must be checked and this sentence updated.</w:t>
-      </w:r>
-    </w:p>
-    <w:bookmarkEnd w:id="87"/>
-    <w:bookmarkEnd w:id="88"/>
-    <w:bookmarkStart w:id="89" w:name="limitations"/>
-    <w:p>
-      <w:pPr>
-        <w:pStyle w:val="Heading1"/>
-      </w:pPr>
-      <w:r>
-        <w:t xml:space="preserve">10. Limitations</w:t>
+        <w:t xml:space="preserve">https://jayvaghela779.github.io/cs3011-public-transport-demand-occupancy/</w:t>
+      </w:r>
+      <w:r>
+        <w:t xml:space="preserve">. It is a static GitHub Pages site. The page (</w:t>
+      </w:r>
+      <w:r>
+        <w:rPr>
+          <w:rStyle w:val="VerbatimChar"/>
+        </w:rPr>
+        <w:t xml:space="preserve">web/index.html</w:t>
+      </w:r>
+      <w:r>
+        <w:t xml:space="preserve">) runs the unchanged</w:t>
+      </w:r>
+      <w:r>
+        <w:t xml:space="preserve"> </w:t>
+      </w:r>
+      <w:r>
+        <w:rPr>
+          <w:rStyle w:val="VerbatimChar"/>
+        </w:rPr>
+        <w:t xml:space="preserve">app/streamlit_app.py</w:t>
+      </w:r>
+      <w:r>
+        <w:t xml:space="preserve"> </w:t>
+      </w:r>
+      <w:r>
+        <w:t xml:space="preserve">inside the visitor’s browser with stlite 1.12.0 (Streamlit 1.65 on Pyodide 314.0.3, that is, Python compiled to WebAssembly). This approach was chosen because:</w:t>
       </w:r>
     </w:p>
     <w:p>
@@ -17376,17 +17483,7 @@
         </w:numPr>
       </w:pPr>
       <w:r>
-        <w:rPr>
-          <w:b/>
-          <w:bCs/>
-        </w:rPr>
-        <w:t xml:space="preserve">Estimated, not measured, occupancy.</w:t>
-      </w:r>
-      <w:r>
-        <w:t xml:space="preserve"> </w:t>
-      </w:r>
-      <w:r>
-        <w:t xml:space="preserve">Alightings are inferred by trip chaining; the load target is an estimate (section 2.2).</w:t>
+        <w:t xml:space="preserve">there is no server that can sleep or fail;</w:t>
       </w:r>
     </w:p>
     <w:p>
@@ -17398,17 +17495,7 @@
         </w:numPr>
       </w:pPr>
       <w:r>
-        <w:rPr>
-          <w:b/>
-          <w:bCs/>
-        </w:rPr>
-        <w:t xml:space="preserve">Under-counting.</w:t>
-      </w:r>
-      <w:r>
-        <w:t xml:space="preserve"> </w:t>
-      </w:r>
-      <w:r>
-        <w:t xml:space="preserve">Riders aged 65 and over are not recorded; recorded weekday boardings are about 85% of the city’s published figure.</w:t>
+        <w:t xml:space="preserve">no account is needed beyond the repository’s own GitHub account;</w:t>
       </w:r>
     </w:p>
     <w:p>
@@ -17420,203 +17507,73 @@
         </w:numPr>
       </w:pPr>
       <w:r>
+        <w:t xml:space="preserve">the site updates itself from</w:t>
+      </w:r>
+      <w:r>
+        <w:t xml:space="preserve"> </w:t>
+      </w:r>
+      <w:r>
+        <w:rPr>
+          <w:rStyle w:val="VerbatimChar"/>
+        </w:rPr>
+        <w:t xml:space="preserve">main</w:t>
+      </w:r>
+      <w:r>
+        <w:t xml:space="preserve">.</w:t>
+      </w:r>
+    </w:p>
+    <w:p>
+      <w:pPr>
+        <w:pStyle w:val="FirstParagraph"/>
+      </w:pPr>
+      <w:r>
         <w:rPr>
           <w:b/>
           <w:bCs/>
         </w:rPr>
-        <w:t xml:space="preserve">Assumed capacity.</w:t>
-      </w:r>
-      <w:r>
-        <w:t xml:space="preserve"> </w:t>
-      </w:r>
-      <w:r>
-        <w:t xml:space="preserve">Crowding levels depend on an assumed vehicle capacity; results change markedly between scenarios (Table 8).</w:t>
-      </w:r>
-    </w:p>
-    <w:p>
-      <w:pPr>
-        <w:pStyle w:val="Compact"/>
-        <w:numPr>
-          <w:ilvl w:val="0"/>
-          <w:numId w:val="1014"/>
-        </w:numPr>
-      </w:pPr>
-      <w:r>
-        <w:rPr>
-          <w:b/>
-          <w:bCs/>
-        </w:rPr>
-        <w:t xml:space="preserve">One city and 59 days.</w:t>
-      </w:r>
-      <w:r>
-        <w:t xml:space="preserve"> </w:t>
-      </w:r>
-      <w:r>
-        <w:t xml:space="preserve">All data is from Salvador, Brazil, March–April 2024. Nothing here is validated for Indian or tier-2 cities, or for other seasons.</w:t>
-      </w:r>
-    </w:p>
-    <w:p>
-      <w:pPr>
-        <w:pStyle w:val="Compact"/>
-        <w:numPr>
-          <w:ilvl w:val="0"/>
-          <w:numId w:val="1014"/>
-        </w:numPr>
-      </w:pPr>
-      <w:r>
-        <w:rPr>
-          <w:b/>
-          <w:bCs/>
-        </w:rPr>
-        <w:t xml:space="preserve">No holiday in the test weeks.</w:t>
-      </w:r>
-      <w:r>
-        <w:t xml:space="preserve"> </w:t>
-      </w:r>
-      <w:r>
-        <w:t xml:space="preserve">Holiday behaviour is not tested.</w:t>
-      </w:r>
-    </w:p>
-    <w:p>
-      <w:pPr>
-        <w:pStyle w:val="Compact"/>
-        <w:numPr>
-          <w:ilvl w:val="0"/>
-          <w:numId w:val="1014"/>
-        </w:numPr>
-      </w:pPr>
-      <w:r>
-        <w:rPr>
-          <w:b/>
-          <w:bCs/>
-        </w:rPr>
-        <w:t xml:space="preserve">Conditional forecast.</w:t>
-      </w:r>
-      <w:r>
-        <w:t xml:space="preserve"> </w:t>
-      </w:r>
-      <w:r>
-        <w:t xml:space="preserve">Forecasts assume the route runs in that hour; missing records are not scored, and cancellations are not predicted.</w:t>
-      </w:r>
-    </w:p>
-    <w:p>
-      <w:pPr>
-        <w:pStyle w:val="Compact"/>
-        <w:numPr>
-          <w:ilvl w:val="0"/>
-          <w:numId w:val="1014"/>
-        </w:numPr>
-      </w:pPr>
-      <w:r>
-        <w:rPr>
-          <w:b/>
-          <w:bCs/>
-        </w:rPr>
-        <w:t xml:space="preserve">Small gain over a strong baseline.</w:t>
-      </w:r>
-      <w:r>
-        <w:t xml:space="preserve"> </w:t>
-      </w:r>
-      <w:r>
-        <w:t xml:space="preserve">The model’s advantage over the historical average is 0.20 WAPE points for demand, in absolute error only (on RMSE the historical average is slightly better for demand). The bootstrap interval covers variation across routes within the 14 test days, not across weeks or seasons.</w:t>
-      </w:r>
-    </w:p>
-    <w:p>
-      <w:pPr>
-        <w:pStyle w:val="Compact"/>
-        <w:numPr>
-          <w:ilvl w:val="0"/>
-          <w:numId w:val="1014"/>
-        </w:numPr>
-      </w:pPr>
-      <w:r>
-        <w:rPr>
-          <w:b/>
-          <w:bCs/>
-        </w:rPr>
-        <w:t xml:space="preserve">Test weeks scored twice.</w:t>
-      </w:r>
-      <w:r>
-        <w:t xml:space="preserve"> </w:t>
-      </w:r>
-      <w:r>
-        <w:t xml:space="preserve">Disclosed in section 5.4.</w:t>
-      </w:r>
-    </w:p>
-    <w:p>
-      <w:pPr>
-        <w:pStyle w:val="Compact"/>
-        <w:numPr>
-          <w:ilvl w:val="0"/>
-          <w:numId w:val="1014"/>
-        </w:numPr>
-      </w:pPr>
-      <w:r>
-        <w:rPr>
-          <w:b/>
-          <w:bCs/>
-        </w:rPr>
-        <w:t xml:space="preserve">Night-time load intervals.</w:t>
-      </w:r>
-      <w:r>
-        <w:t xml:space="preserve"> </w:t>
-      </w:r>
-      <w:r>
-        <w:t xml:space="preserve">About 52% coverage instead of 80% (section 8.2).</w:t>
-      </w:r>
-    </w:p>
-    <w:p>
-      <w:pPr>
-        <w:pStyle w:val="Compact"/>
-        <w:numPr>
-          <w:ilvl w:val="0"/>
-          <w:numId w:val="1014"/>
-        </w:numPr>
-      </w:pPr>
-      <w:r>
-        <w:rPr>
-          <w:b/>
-          <w:bCs/>
-        </w:rPr>
-        <w:t xml:space="preserve">Validation optimism.</w:t>
-      </w:r>
-      <w:r>
-        <w:t xml:space="preserve"> </w:t>
-      </w:r>
-      <w:r>
-        <w:t xml:space="preserve">Validation figures were used for selection and are optimistic; the test figures are the honest estimate.</w:t>
-      </w:r>
-    </w:p>
-    <w:p>
-      <w:pPr>
-        <w:pStyle w:val="Compact"/>
-        <w:numPr>
-          <w:ilvl w:val="0"/>
-          <w:numId w:val="1014"/>
-        </w:numPr>
-      </w:pPr>
-      <w:r>
-        <w:rPr>
-          <w:b/>
-          <w:bCs/>
-        </w:rPr>
-        <w:t xml:space="preserve">Not deployed; limited cross-platform reruns.</w:t>
-      </w:r>
-      <w:r>
-        <w:t xml:space="preserve"> </w:t>
-      </w:r>
-      <w:r>
-        <w:t xml:space="preserve">The dashboard runs locally only; the full pipeline has been rerun on Linux but not yet on Windows or Colab.</w:t>
-      </w:r>
-    </w:p>
-    <w:bookmarkEnd w:id="89"/>
-    <w:bookmarkStart w:id="90" w:name="ethical-considerations"/>
-    <w:p>
-      <w:pPr>
-        <w:pStyle w:val="Heading1"/>
-      </w:pPr>
-      <w:r>
-        <w:t xml:space="preserve">11. Ethical considerations</w:t>
+        <w:t xml:space="preserve">How it is published.</w:t>
+      </w:r>
+      <w:r>
+        <w:t xml:space="preserve"> </w:t>
+      </w:r>
+      <w:r>
+        <w:t xml:space="preserve">A GitHub Actions workflow (</w:t>
+      </w:r>
+      <w:r>
+        <w:rPr>
+          <w:rStyle w:val="VerbatimChar"/>
+        </w:rPr>
+        <w:t xml:space="preserve">.github/workflows/pages.yml</w:t>
+      </w:r>
+      <w:r>
+        <w:t xml:space="preserve">) runs</w:t>
+      </w:r>
+      <w:r>
+        <w:t xml:space="preserve"> </w:t>
+      </w:r>
+      <w:r>
+        <w:rPr>
+          <w:rStyle w:val="VerbatimChar"/>
+        </w:rPr>
+        <w:t xml:space="preserve">web/build_site.py</w:t>
+      </w:r>
+      <w:r>
+        <w:t xml:space="preserve"> </w:t>
+      </w:r>
+      <w:r>
+        <w:t xml:space="preserve">whenever the app, its modules or the committed results change on</w:t>
+      </w:r>
+      <w:r>
+        <w:t xml:space="preserve"> </w:t>
+      </w:r>
+      <w:r>
+        <w:rPr>
+          <w:rStyle w:val="VerbatimChar"/>
+        </w:rPr>
+        <w:t xml:space="preserve">main</w:t>
+      </w:r>
+      <w:r>
+        <w:t xml:space="preserve">.</w:t>
       </w:r>
     </w:p>
     <w:p>
@@ -17628,17 +17585,22 @@
         </w:numPr>
       </w:pPr>
       <w:r>
-        <w:rPr>
-          <w:b/>
-          <w:bCs/>
-        </w:rPr>
-        <w:t xml:space="preserve">Privacy.</w:t>
-      </w:r>
-      <w:r>
-        <w:t xml:space="preserve"> </w:t>
-      </w:r>
-      <w:r>
-        <w:t xml:space="preserve">SUNT is built from fare-card and vehicle-location records. We use only the published OD tables, aggregate them to route-hours, and drop stop, vehicle and register identifiers from our outputs. Nothing in this project attempts to identify or track individual travellers.</w:t>
+        <w:t xml:space="preserve">It copies the app code and result files to the</w:t>
+      </w:r>
+      <w:r>
+        <w:t xml:space="preserve"> </w:t>
+      </w:r>
+      <w:r>
+        <w:rPr>
+          <w:rStyle w:val="VerbatimChar"/>
+        </w:rPr>
+        <w:t xml:space="preserve">gh-pages</w:t>
+      </w:r>
+      <w:r>
+        <w:t xml:space="preserve"> </w:t>
+      </w:r>
+      <w:r>
+        <w:t xml:space="preserve">branch together with a SHA-256 manifest.</w:t>
       </w:r>
     </w:p>
     <w:p>
@@ -17650,188 +17612,46 @@
         </w:numPr>
       </w:pPr>
       <w:r>
+        <w:t xml:space="preserve">It also copies three pinned, hash-checked Python wheels (</w:t>
+      </w:r>
+      <w:r>
+        <w:rPr>
+          <w:rStyle w:val="VerbatimChar"/>
+        </w:rPr>
+        <w:t xml:space="preserve">web/wheels.txt</w:t>
+      </w:r>
+      <w:r>
+        <w:t xml:space="preserve">).</w:t>
+      </w:r>
+    </w:p>
+    <w:p>
+      <w:pPr>
+        <w:pStyle w:val="FirstParagraph"/>
+      </w:pPr>
+      <w:r>
         <w:rPr>
           <w:b/>
           <w:bCs/>
         </w:rPr>
-        <w:t xml:space="preserve">Fairness and representation.</w:t>
-      </w:r>
-      <w:r>
-        <w:t xml:space="preserve"> </w:t>
-      </w:r>
-      <w:r>
-        <w:t xml:space="preserve">Riders aged 65 and over, who travel free without a card, are invisible in the data. Planning purely from these forecasts could under-provide service on routes and at times used mainly by older passengers. Any operational use should correct for known gaps with other counts.</w:t>
-      </w:r>
-    </w:p>
-    <w:p>
-      <w:pPr>
-        <w:pStyle w:val="Compact"/>
-        <w:numPr>
-          <w:ilvl w:val="0"/>
-          <w:numId w:val="1015"/>
-        </w:numPr>
+        <w:t xml:space="preserve">How it loads.</w:t>
+      </w:r>
+      <w:r>
+        <w:t xml:space="preserve"> </w:t>
+      </w:r>
+      <w:r>
+        <w:t xml:space="preserve">The page downloads every file through jsDelivr’s mirror of that branch and checks each one against the manifest. It re-fetches any stale or failed copy from GitHub Pages itself. So the public site shows exactly the committed results, and no metric or prediction file is changed for it.</w:t>
+      </w:r>
+    </w:p>
+    <w:p>
+      <w:pPr>
+        <w:pStyle w:val="BodyText"/>
       </w:pPr>
       <w:r>
         <w:rPr>
           <w:b/>
           <w:bCs/>
         </w:rPr>
-        <w:t xml:space="preserve">Honest labelling.</w:t>
-      </w:r>
-      <w:r>
-        <w:t xml:space="preserve"> </w:t>
-      </w:r>
-      <w:r>
-        <w:t xml:space="preserve">Calling an inferred quantity</w:t>
-      </w:r>
-      <w:r>
-        <w:t xml:space="preserve"> </w:t>
-      </w:r>
-      <w:r>
-        <w:t xml:space="preserve">“</w:t>
-      </w:r>
-      <w:r>
-        <w:t xml:space="preserve">occupancy</w:t>
-      </w:r>
-      <w:r>
-        <w:t xml:space="preserve">”</w:t>
-      </w:r>
-      <w:r>
-        <w:t xml:space="preserve"> </w:t>
-      </w:r>
-      <w:r>
-        <w:t xml:space="preserve">without qualification could mislead decision-makers. We use</w:t>
-      </w:r>
-      <w:r>
-        <w:t xml:space="preserve"> </w:t>
-      </w:r>
-      <w:r>
-        <w:t xml:space="preserve">“</w:t>
-      </w:r>
-      <w:r>
-        <w:t xml:space="preserve">estimated on-board load</w:t>
-      </w:r>
-      <w:r>
-        <w:t xml:space="preserve">”</w:t>
-      </w:r>
-      <w:r>
-        <w:t xml:space="preserve"> </w:t>
-      </w:r>
-      <w:r>
-        <w:t xml:space="preserve">throughout, in the code, the dashboard and this report.</w:t>
-      </w:r>
-    </w:p>
-    <w:p>
-      <w:pPr>
-        <w:pStyle w:val="Compact"/>
-        <w:numPr>
-          <w:ilvl w:val="0"/>
-          <w:numId w:val="1015"/>
-        </w:numPr>
-      </w:pPr>
-      <w:r>
-        <w:rPr>
-          <w:b/>
-          <w:bCs/>
-        </w:rPr>
-        <w:t xml:space="preserve">Automation bias.</w:t>
-      </w:r>
-      <w:r>
-        <w:t xml:space="preserve"> </w:t>
-      </w:r>
-      <w:r>
-        <w:t xml:space="preserve">The dashboard presents forecasts and crowding colours with an air of precision. Prediction intervals, the capacity selector and the caveats page are there so that users see uncertainty and assumptions, not just a single number. Night-time load ranges should not be trusted as 80% ranges.</w:t>
-      </w:r>
-    </w:p>
-    <w:p>
-      <w:pPr>
-        <w:pStyle w:val="Compact"/>
-        <w:numPr>
-          <w:ilvl w:val="0"/>
-          <w:numId w:val="1015"/>
-        </w:numPr>
-      </w:pPr>
-      <w:r>
-        <w:rPr>
-          <w:b/>
-          <w:bCs/>
-        </w:rPr>
-        <w:t xml:space="preserve">Transferability.</w:t>
-      </w:r>
-      <w:r>
-        <w:t xml:space="preserve"> </w:t>
-      </w:r>
-      <w:r>
-        <w:t xml:space="preserve">A model trained on Salvador should not be applied to other cities, including Indian cities, without retraining and validation on local data.</w:t>
-      </w:r>
-    </w:p>
-    <w:p>
-      <w:pPr>
-        <w:pStyle w:val="Compact"/>
-        <w:numPr>
-          <w:ilvl w:val="0"/>
-          <w:numId w:val="1015"/>
-        </w:numPr>
-      </w:pPr>
-      <w:r>
-        <w:rPr>
-          <w:b/>
-          <w:bCs/>
-        </w:rPr>
-        <w:t xml:space="preserve">Licensing and credit.</w:t>
-      </w:r>
-      <w:r>
-        <w:t xml:space="preserve"> </w:t>
-      </w:r>
-      <w:r>
-        <w:t xml:space="preserve">The data is used under CC BY 4.0 with attribution and a statement of changes. Repositories without a licence were read for ideas only and are cited, not copied.</w:t>
-      </w:r>
-    </w:p>
-    <w:p>
-      <w:pPr>
-        <w:pStyle w:val="Compact"/>
-        <w:numPr>
-          <w:ilvl w:val="0"/>
-          <w:numId w:val="1015"/>
-        </w:numPr>
-      </w:pPr>
-      <w:r>
-        <w:rPr>
-          <w:b/>
-          <w:bCs/>
-        </w:rPr>
-        <w:t xml:space="preserve">Use of AI assistance.</w:t>
-      </w:r>
-      <w:r>
-        <w:t xml:space="preserve"> </w:t>
-      </w:r>
-      <w:r>
-        <w:t xml:space="preserve">The code and documents in the repository, including this report, were written in AI-assisted sessions with Claude (Anthropic), directed and reviewed by the group lead. Every such commit carries a</w:t>
-      </w:r>
-      <w:r>
-        <w:t xml:space="preserve"> </w:t>
-      </w:r>
-      <w:r>
-        <w:rPr>
-          <w:rStyle w:val="VerbatimChar"/>
-        </w:rPr>
-        <w:t xml:space="preserve">Co-Authored-By</w:t>
-      </w:r>
-      <w:r>
-        <w:t xml:space="preserve"> </w:t>
-      </w:r>
-      <w:r>
-        <w:t xml:space="preserve">line; as of 24 October 2026 that is every commit. The team remains responsible for the content and must be able to explain it.</w:t>
-      </w:r>
-    </w:p>
-    <w:bookmarkEnd w:id="90"/>
-    <w:bookmarkStart w:id="91" w:name="Xe3c24a0b61a45f5f1c7a8563dfd6b781e702cf6"/>
-    <w:p>
-      <w:pPr>
-        <w:pStyle w:val="Heading1"/>
-      </w:pPr>
-      <w:r>
-        <w:t xml:space="preserve">12. Future work (proposed; none of this has been done)</w:t>
+        <w:t xml:space="preserve">Checked on 24 October 2026 (measured).</w:t>
       </w:r>
     </w:p>
     <w:p>
@@ -17843,17 +17663,22 @@
         </w:numPr>
       </w:pPr>
       <w:r>
-        <w:rPr>
-          <w:b/>
-          <w:bCs/>
-        </w:rPr>
-        <w:t xml:space="preserve">Per-period interval calibration:</w:t>
-      </w:r>
-      <w:r>
-        <w:t xml:space="preserve"> </w:t>
-      </w:r>
-      <w:r>
-        <w:t xml:space="preserve">a separate conformal margin for each period of the day, set on validation, to address the night-time gap (D13). Any new evaluation should use new held-out weeks.</w:t>
+        <w:t xml:space="preserve">The published files are byte-identical to</w:t>
+      </w:r>
+      <w:r>
+        <w:t xml:space="preserve"> </w:t>
+      </w:r>
+      <w:r>
+        <w:rPr>
+          <w:rStyle w:val="VerbatimChar"/>
+        </w:rPr>
+        <w:t xml:space="preserve">main</w:t>
+      </w:r>
+      <w:r>
+        <w:t xml:space="preserve"> </w:t>
+      </w:r>
+      <w:r>
+        <w:t xml:space="preserve">(11 app and data files).</w:t>
       </w:r>
     </w:p>
     <w:p>
@@ -17865,17 +17690,73 @@
         </w:numPr>
       </w:pPr>
       <w:r>
+        <w:t xml:space="preserve">In a real browser on an Indian home connection, all five pages worked and showed the same values as the local app:</w:t>
+      </w:r>
+    </w:p>
+    <w:p>
+      <w:pPr>
+        <w:pStyle w:val="Compact"/>
+        <w:numPr>
+          <w:ilvl w:val="1"/>
+          <w:numId w:val="1017"/>
+        </w:numPr>
+      </w:pPr>
+      <w:r>
+        <w:t xml:space="preserve">route 137 I on 17 April: day WAPE 15.3% against 7.7%;</w:t>
+      </w:r>
+    </w:p>
+    <w:p>
+      <w:pPr>
+        <w:pStyle w:val="Compact"/>
+        <w:numPr>
+          <w:ilvl w:val="1"/>
+          <w:numId w:val="1017"/>
+        </w:numPr>
+      </w:pPr>
+      <w:r>
+        <w:t xml:space="preserve">next day: 9,566 route-hours, 481 of them high crowding;</w:t>
+      </w:r>
+    </w:p>
+    <w:p>
+      <w:pPr>
+        <w:pStyle w:val="Compact"/>
+        <w:numPr>
+          <w:ilvl w:val="1"/>
+          <w:numId w:val="1017"/>
+        </w:numPr>
+      </w:pPr>
+      <w:r>
+        <w:t xml:space="preserve">the in-browser recomputation matched all ten reported test WAPEs;</w:t>
+      </w:r>
+    </w:p>
+    <w:p>
+      <w:pPr>
+        <w:pStyle w:val="Compact"/>
+        <w:numPr>
+          <w:ilvl w:val="1"/>
+          <w:numId w:val="1017"/>
+        </w:numPr>
+      </w:pPr>
+      <w:r>
+        <w:t xml:space="preserve">no Python errors.</w:t>
+      </w:r>
+    </w:p>
+    <w:p>
+      <w:pPr>
+        <w:pStyle w:val="FirstParagraph"/>
+      </w:pPr>
+      <w:r>
         <w:rPr>
           <w:b/>
           <w:bCs/>
         </w:rPr>
-        <w:t xml:space="preserve">Fresh held-out data:</w:t>
-      </w:r>
-      <w:r>
-        <w:t xml:space="preserve"> </w:t>
-      </w:r>
-      <w:r>
-        <w:t xml:space="preserve">re-evaluate on later SUNT weeks (for example May 2024, if available at the pinned source) so that the final method is tested on weeks never seen before.</w:t>
+        <w:t xml:space="preserve">Load time (measured).</w:t>
+      </w:r>
+      <w:r>
+        <w:t xml:space="preserve"> </w:t>
+      </w:r>
+      <w:r>
+        <w:t xml:space="preserve">A first visit downloads about 85 MB: 27 MB of results and about 55 MB of Python runtime and packages.</w:t>
       </w:r>
     </w:p>
     <w:p>
@@ -17883,54 +17764,11 @@
         <w:pStyle w:val="Compact"/>
         <w:numPr>
           <w:ilvl w:val="0"/>
-          <w:numId w:val="1016"/>
+          <w:numId w:val="1018"/>
         </w:numPr>
       </w:pPr>
       <w:r>
-        <w:rPr>
-          <w:b/>
-          <w:bCs/>
-        </w:rPr>
-        <w:t xml:space="preserve">Better inputs:</w:t>
-      </w:r>
-      <w:r>
-        <w:t xml:space="preserve"> </w:t>
-      </w:r>
-      <w:r>
-        <w:t xml:space="preserve">weather, events and holidays; timetable data for the study period, which would separate</w:t>
-      </w:r>
-      <w:r>
-        <w:t xml:space="preserve"> </w:t>
-      </w:r>
-      <w:r>
-        <w:t xml:space="preserve">“</w:t>
-      </w:r>
-      <w:r>
-        <w:t xml:space="preserve">no service</w:t>
-      </w:r>
-      <w:r>
-        <w:t xml:space="preserve">”</w:t>
-      </w:r>
-      <w:r>
-        <w:t xml:space="preserve"> </w:t>
-      </w:r>
-      <w:r>
-        <w:t xml:space="preserve">from</w:t>
-      </w:r>
-      <w:r>
-        <w:t xml:space="preserve"> </w:t>
-      </w:r>
-      <w:r>
-        <w:t xml:space="preserve">“</w:t>
-      </w:r>
-      <w:r>
-        <w:t xml:space="preserve">no record</w:t>
-      </w:r>
-      <w:r>
-        <w:t xml:space="preserve">”</w:t>
-      </w:r>
-      <w:r>
-        <w:t xml:space="preserve">.</w:t>
+        <w:t xml:space="preserve">A cold load took 83 s on a connection throttled to 10 Mbit/s, and 340 s (about 5 minutes 40 seconds) at 2 Mbit/s, the speed measured on the home network above.</w:t>
       </w:r>
     </w:p>
     <w:p>
@@ -17938,21 +17776,11 @@
         <w:pStyle w:val="Compact"/>
         <w:numPr>
           <w:ilvl w:val="0"/>
-          <w:numId w:val="1016"/>
+          <w:numId w:val="1018"/>
         </w:numPr>
       </w:pPr>
       <w:r>
-        <w:rPr>
-          <w:b/>
-          <w:bCs/>
-        </w:rPr>
-        <w:t xml:space="preserve">Real capacity and counts:</w:t>
-      </w:r>
-      <w:r>
-        <w:t xml:space="preserve"> </w:t>
-      </w:r>
-      <w:r>
-        <w:t xml:space="preserve">vehicle assignments per trip, or automatic passenger counters, to replace the assumed capacity and to validate the estimated load.</w:t>
+        <w:t xml:space="preserve">Repeat visits use the browser cache and were ready in about 40 s.</w:t>
       </w:r>
     </w:p>
     <w:p>
@@ -17960,21 +17788,56 @@
         <w:pStyle w:val="Compact"/>
         <w:numPr>
           <w:ilvl w:val="0"/>
-          <w:numId w:val="1016"/>
+          <w:numId w:val="1018"/>
         </w:numPr>
       </w:pPr>
       <w:r>
-        <w:rPr>
-          <w:b/>
-          <w:bCs/>
-        </w:rPr>
-        <w:t xml:space="preserve">Other cities:</w:t>
-      </w:r>
-      <w:r>
-        <w:t xml:space="preserve"> </w:t>
-      </w:r>
-      <w:r>
-        <w:t xml:space="preserve">test the pipeline on another open dataset with real counts, ideally from an Indian city, before making any claim beyond Salvador.</w:t>
+        <w:t xml:space="preserve">On the tested home network,</w:t>
+      </w:r>
+      <w:r>
+        <w:t xml:space="preserve"> </w:t>
+      </w:r>
+      <w:r>
+        <w:rPr>
+          <w:rStyle w:val="VerbatimChar"/>
+        </w:rPr>
+        <w:t xml:space="preserve">raw.githubusercontent.com</w:t>
+      </w:r>
+      <w:r>
+        <w:t xml:space="preserve"> </w:t>
+      </w:r>
+      <w:r>
+        <w:t xml:space="preserve">and</w:t>
+      </w:r>
+      <w:r>
+        <w:t xml:space="preserve"> </w:t>
+      </w:r>
+      <w:r>
+        <w:rPr>
+          <w:rStyle w:val="VerbatimChar"/>
+        </w:rPr>
+        <w:t xml:space="preserve">files.pythonhosted.org</w:t>
+      </w:r>
+      <w:r>
+        <w:t xml:space="preserve"> </w:t>
+      </w:r>
+      <w:r>
+        <w:t xml:space="preserve">were throttled to almost nothing, and</w:t>
+      </w:r>
+      <w:r>
+        <w:t xml:space="preserve"> </w:t>
+      </w:r>
+      <w:r>
+        <w:rPr>
+          <w:rStyle w:val="VerbatimChar"/>
+        </w:rPr>
+        <w:t xml:space="preserve">github.io</w:t>
+      </w:r>
+      <w:r>
+        <w:t xml:space="preserve"> </w:t>
+      </w:r>
+      <w:r>
+        <w:t xml:space="preserve">was slow for large files. That is why the page downloads through jsDelivr and serves the three wheels itself.</w:t>
       </w:r>
     </w:p>
     <w:p>
@@ -17982,39 +17845,30 @@
         <w:pStyle w:val="Compact"/>
         <w:numPr>
           <w:ilvl w:val="0"/>
-          <w:numId w:val="1016"/>
+          <w:numId w:val="1018"/>
         </w:numPr>
       </w:pPr>
       <w:r>
-        <w:rPr>
-          <w:b/>
-          <w:bCs/>
-        </w:rPr>
-        <w:t xml:space="preserve">Planning outputs:</w:t>
-      </w:r>
-      <w:r>
-        <w:t xml:space="preserve"> </w:t>
-      </w:r>
-      <w:r>
-        <w:t xml:space="preserve">an</w:t>
-      </w:r>
-      <w:r>
-        <w:t xml:space="preserve"> </w:t>
-      </w:r>
-      <w:r>
-        <w:t xml:space="preserve">“</w:t>
-      </w:r>
-      <w:r>
-        <w:t xml:space="preserve">extra trips needed</w:t>
-      </w:r>
-      <w:r>
-        <w:t xml:space="preserve">”</w:t>
-      </w:r>
-      <w:r>
-        <w:t xml:space="preserve"> </w:t>
-      </w:r>
-      <w:r>
-        <w:t xml:space="preserve">estimate under a stated capacity assumption (D5), shown as illustrative only.</w:t>
+        <w:t xml:space="preserve">Once, a runtime download stalled inside Pyodide’s loader; the page now suggests a reload after two minutes without progress.</w:t>
+      </w:r>
+    </w:p>
+    <w:p>
+      <w:pPr>
+        <w:pStyle w:val="FirstParagraph"/>
+      </w:pPr>
+      <w:r>
+        <w:t xml:space="preserve">For the evaluation the local app remains the primary demo: it starts instantly and needs no internet.</w:t>
+      </w:r>
+    </w:p>
+    <w:bookmarkEnd w:id="88"/>
+    <w:bookmarkEnd w:id="89"/>
+    <w:bookmarkStart w:id="90" w:name="limitations"/>
+    <w:p>
+      <w:pPr>
+        <w:pStyle w:val="Heading1"/>
+      </w:pPr>
+      <w:r>
+        <w:t xml:space="preserve">10. Limitations</w:t>
       </w:r>
     </w:p>
     <w:p>
@@ -18022,7 +17876,7 @@
         <w:pStyle w:val="Compact"/>
         <w:numPr>
           <w:ilvl w:val="0"/>
-          <w:numId w:val="1016"/>
+          <w:numId w:val="1019"/>
         </w:numPr>
       </w:pPr>
       <w:r>
@@ -18030,22 +17884,672 @@
           <w:b/>
           <w:bCs/>
         </w:rPr>
-        <w:t xml:space="preserve">Deployment:</w:t>
-      </w:r>
-      <w:r>
-        <w:t xml:space="preserve"> </w:t>
-      </w:r>
-      <w:r>
-        <w:t xml:space="preserve">host the dashboard on a free service and document how it was checked.</w:t>
+        <w:t xml:space="preserve">Estimated, not measured, occupancy.</w:t>
+      </w:r>
+      <w:r>
+        <w:t xml:space="preserve"> </w:t>
+      </w:r>
+      <w:r>
+        <w:t xml:space="preserve">Alightings are inferred by trip chaining; the load target is an estimate (section 2.2).</w:t>
+      </w:r>
+    </w:p>
+    <w:p>
+      <w:pPr>
+        <w:pStyle w:val="Compact"/>
+        <w:numPr>
+          <w:ilvl w:val="0"/>
+          <w:numId w:val="1019"/>
+        </w:numPr>
+      </w:pPr>
+      <w:r>
+        <w:rPr>
+          <w:b/>
+          <w:bCs/>
+        </w:rPr>
+        <w:t xml:space="preserve">Under-counting.</w:t>
+      </w:r>
+      <w:r>
+        <w:t xml:space="preserve"> </w:t>
+      </w:r>
+      <w:r>
+        <w:t xml:space="preserve">Riders aged 65 and over are not recorded; recorded weekday boardings are about 85% of the city’s published figure.</w:t>
+      </w:r>
+    </w:p>
+    <w:p>
+      <w:pPr>
+        <w:pStyle w:val="Compact"/>
+        <w:numPr>
+          <w:ilvl w:val="0"/>
+          <w:numId w:val="1019"/>
+        </w:numPr>
+      </w:pPr>
+      <w:r>
+        <w:rPr>
+          <w:b/>
+          <w:bCs/>
+        </w:rPr>
+        <w:t xml:space="preserve">Assumed capacity.</w:t>
+      </w:r>
+      <w:r>
+        <w:t xml:space="preserve"> </w:t>
+      </w:r>
+      <w:r>
+        <w:t xml:space="preserve">Crowding levels depend on an assumed vehicle capacity; results change markedly between scenarios (Table 8).</w:t>
+      </w:r>
+    </w:p>
+    <w:p>
+      <w:pPr>
+        <w:pStyle w:val="Compact"/>
+        <w:numPr>
+          <w:ilvl w:val="0"/>
+          <w:numId w:val="1019"/>
+        </w:numPr>
+      </w:pPr>
+      <w:r>
+        <w:rPr>
+          <w:b/>
+          <w:bCs/>
+        </w:rPr>
+        <w:t xml:space="preserve">One city and 59 days.</w:t>
+      </w:r>
+      <w:r>
+        <w:t xml:space="preserve"> </w:t>
+      </w:r>
+      <w:r>
+        <w:t xml:space="preserve">All data is from Salvador, Brazil, March–April 2024. Nothing here is validated for Indian or tier-2 cities, or for other seasons.</w:t>
+      </w:r>
+    </w:p>
+    <w:p>
+      <w:pPr>
+        <w:pStyle w:val="Compact"/>
+        <w:numPr>
+          <w:ilvl w:val="0"/>
+          <w:numId w:val="1019"/>
+        </w:numPr>
+      </w:pPr>
+      <w:r>
+        <w:rPr>
+          <w:b/>
+          <w:bCs/>
+        </w:rPr>
+        <w:t xml:space="preserve">No holiday in the test weeks.</w:t>
+      </w:r>
+      <w:r>
+        <w:t xml:space="preserve"> </w:t>
+      </w:r>
+      <w:r>
+        <w:t xml:space="preserve">Holiday behaviour is not tested.</w:t>
+      </w:r>
+    </w:p>
+    <w:p>
+      <w:pPr>
+        <w:pStyle w:val="Compact"/>
+        <w:numPr>
+          <w:ilvl w:val="0"/>
+          <w:numId w:val="1019"/>
+        </w:numPr>
+      </w:pPr>
+      <w:r>
+        <w:rPr>
+          <w:b/>
+          <w:bCs/>
+        </w:rPr>
+        <w:t xml:space="preserve">Conditional forecast.</w:t>
+      </w:r>
+      <w:r>
+        <w:t xml:space="preserve"> </w:t>
+      </w:r>
+      <w:r>
+        <w:t xml:space="preserve">Forecasts assume the route runs in that hour; missing records are not scored, and cancellations are not predicted.</w:t>
+      </w:r>
+    </w:p>
+    <w:p>
+      <w:pPr>
+        <w:pStyle w:val="Compact"/>
+        <w:numPr>
+          <w:ilvl w:val="0"/>
+          <w:numId w:val="1019"/>
+        </w:numPr>
+      </w:pPr>
+      <w:r>
+        <w:rPr>
+          <w:b/>
+          <w:bCs/>
+        </w:rPr>
+        <w:t xml:space="preserve">Small gain over a strong baseline.</w:t>
+      </w:r>
+      <w:r>
+        <w:t xml:space="preserve"> </w:t>
+      </w:r>
+      <w:r>
+        <w:t xml:space="preserve">The model’s advantage over the historical average is 0.20 WAPE points for demand, in absolute error only (on RMSE the historical average is slightly better for demand). The bootstrap interval covers variation across routes within the 14 test days, not across weeks or seasons.</w:t>
+      </w:r>
+    </w:p>
+    <w:p>
+      <w:pPr>
+        <w:pStyle w:val="Compact"/>
+        <w:numPr>
+          <w:ilvl w:val="0"/>
+          <w:numId w:val="1019"/>
+        </w:numPr>
+      </w:pPr>
+      <w:r>
+        <w:rPr>
+          <w:b/>
+          <w:bCs/>
+        </w:rPr>
+        <w:t xml:space="preserve">Test weeks scored twice.</w:t>
+      </w:r>
+      <w:r>
+        <w:t xml:space="preserve"> </w:t>
+      </w:r>
+      <w:r>
+        <w:t xml:space="preserve">Disclosed in section 5.4.</w:t>
+      </w:r>
+    </w:p>
+    <w:p>
+      <w:pPr>
+        <w:pStyle w:val="Compact"/>
+        <w:numPr>
+          <w:ilvl w:val="0"/>
+          <w:numId w:val="1019"/>
+        </w:numPr>
+      </w:pPr>
+      <w:r>
+        <w:rPr>
+          <w:b/>
+          <w:bCs/>
+        </w:rPr>
+        <w:t xml:space="preserve">Night-time load intervals.</w:t>
+      </w:r>
+      <w:r>
+        <w:t xml:space="preserve"> </w:t>
+      </w:r>
+      <w:r>
+        <w:t xml:space="preserve">About 52% coverage instead of 80% (section 8.2).</w:t>
+      </w:r>
+    </w:p>
+    <w:p>
+      <w:pPr>
+        <w:pStyle w:val="Compact"/>
+        <w:numPr>
+          <w:ilvl w:val="0"/>
+          <w:numId w:val="1019"/>
+        </w:numPr>
+      </w:pPr>
+      <w:r>
+        <w:rPr>
+          <w:b/>
+          <w:bCs/>
+        </w:rPr>
+        <w:t xml:space="preserve">Validation optimism.</w:t>
+      </w:r>
+      <w:r>
+        <w:t xml:space="preserve"> </w:t>
+      </w:r>
+      <w:r>
+        <w:t xml:space="preserve">Validation figures were used for selection and are optimistic; the test figures are the honest estimate.</w:t>
+      </w:r>
+    </w:p>
+    <w:p>
+      <w:pPr>
+        <w:pStyle w:val="Compact"/>
+        <w:numPr>
+          <w:ilvl w:val="0"/>
+          <w:numId w:val="1019"/>
+        </w:numPr>
+      </w:pPr>
+      <w:r>
+        <w:rPr>
+          <w:b/>
+          <w:bCs/>
+        </w:rPr>
+        <w:t xml:space="preserve">Heavy public dashboard; limited cross-platform reruns.</w:t>
+      </w:r>
+      <w:r>
+        <w:t xml:space="preserve"> </w:t>
+      </w:r>
+      <w:r>
+        <w:t xml:space="preserve">The public dashboard downloads about 85 MB on a first visit and needs a recent browser. It runs Streamlit 1.65 on Pyodide rather than the local Streamlit 1.66, so small visual differences are possible. The full pipeline has been rerun on Linux but not yet on Windows or Colab.</w:t>
+      </w:r>
+    </w:p>
+    <w:bookmarkEnd w:id="90"/>
+    <w:bookmarkStart w:id="91" w:name="ethical-considerations"/>
+    <w:p>
+      <w:pPr>
+        <w:pStyle w:val="Heading1"/>
+      </w:pPr>
+      <w:r>
+        <w:t xml:space="preserve">11. Ethical considerations</w:t>
+      </w:r>
+    </w:p>
+    <w:p>
+      <w:pPr>
+        <w:pStyle w:val="Compact"/>
+        <w:numPr>
+          <w:ilvl w:val="0"/>
+          <w:numId w:val="1020"/>
+        </w:numPr>
+      </w:pPr>
+      <w:r>
+        <w:rPr>
+          <w:b/>
+          <w:bCs/>
+        </w:rPr>
+        <w:t xml:space="preserve">Privacy.</w:t>
+      </w:r>
+      <w:r>
+        <w:t xml:space="preserve"> </w:t>
+      </w:r>
+      <w:r>
+        <w:t xml:space="preserve">SUNT is built from fare-card and vehicle-location records. We use only the published OD tables, aggregate them to route-hours, and drop stop, vehicle and register identifiers from our outputs. Nothing in this project attempts to identify or track individual travellers.</w:t>
+      </w:r>
+    </w:p>
+    <w:p>
+      <w:pPr>
+        <w:pStyle w:val="Compact"/>
+        <w:numPr>
+          <w:ilvl w:val="0"/>
+          <w:numId w:val="1020"/>
+        </w:numPr>
+      </w:pPr>
+      <w:r>
+        <w:rPr>
+          <w:b/>
+          <w:bCs/>
+        </w:rPr>
+        <w:t xml:space="preserve">Fairness and representation.</w:t>
+      </w:r>
+      <w:r>
+        <w:t xml:space="preserve"> </w:t>
+      </w:r>
+      <w:r>
+        <w:t xml:space="preserve">Riders aged 65 and over, who travel free without a card, are invisible in the data. Planning purely from these forecasts could under-provide service on routes and at times used mainly by older passengers. Any operational use should correct for known gaps with other counts.</w:t>
+      </w:r>
+    </w:p>
+    <w:p>
+      <w:pPr>
+        <w:pStyle w:val="Compact"/>
+        <w:numPr>
+          <w:ilvl w:val="0"/>
+          <w:numId w:val="1020"/>
+        </w:numPr>
+      </w:pPr>
+      <w:r>
+        <w:rPr>
+          <w:b/>
+          <w:bCs/>
+        </w:rPr>
+        <w:t xml:space="preserve">Honest labelling.</w:t>
+      </w:r>
+      <w:r>
+        <w:t xml:space="preserve"> </w:t>
+      </w:r>
+      <w:r>
+        <w:t xml:space="preserve">Calling an inferred quantity</w:t>
+      </w:r>
+      <w:r>
+        <w:t xml:space="preserve"> </w:t>
+      </w:r>
+      <w:r>
+        <w:t xml:space="preserve">“</w:t>
+      </w:r>
+      <w:r>
+        <w:t xml:space="preserve">occupancy</w:t>
+      </w:r>
+      <w:r>
+        <w:t xml:space="preserve">”</w:t>
+      </w:r>
+      <w:r>
+        <w:t xml:space="preserve"> </w:t>
+      </w:r>
+      <w:r>
+        <w:t xml:space="preserve">without qualification could mislead decision-makers. We use</w:t>
+      </w:r>
+      <w:r>
+        <w:t xml:space="preserve"> </w:t>
+      </w:r>
+      <w:r>
+        <w:t xml:space="preserve">“</w:t>
+      </w:r>
+      <w:r>
+        <w:t xml:space="preserve">estimated on-board load</w:t>
+      </w:r>
+      <w:r>
+        <w:t xml:space="preserve">”</w:t>
+      </w:r>
+      <w:r>
+        <w:t xml:space="preserve"> </w:t>
+      </w:r>
+      <w:r>
+        <w:t xml:space="preserve">throughout, in the code, the dashboard and this report.</w:t>
+      </w:r>
+    </w:p>
+    <w:p>
+      <w:pPr>
+        <w:pStyle w:val="Compact"/>
+        <w:numPr>
+          <w:ilvl w:val="0"/>
+          <w:numId w:val="1020"/>
+        </w:numPr>
+      </w:pPr>
+      <w:r>
+        <w:rPr>
+          <w:b/>
+          <w:bCs/>
+        </w:rPr>
+        <w:t xml:space="preserve">Automation bias.</w:t>
+      </w:r>
+      <w:r>
+        <w:t xml:space="preserve"> </w:t>
+      </w:r>
+      <w:r>
+        <w:t xml:space="preserve">The dashboard presents forecasts and crowding colours with an air of precision. Prediction intervals, the capacity selector and the caveats page are there so that users see uncertainty and assumptions, not just a single number. Night-time load ranges should not be trusted as 80% ranges.</w:t>
+      </w:r>
+    </w:p>
+    <w:p>
+      <w:pPr>
+        <w:pStyle w:val="Compact"/>
+        <w:numPr>
+          <w:ilvl w:val="0"/>
+          <w:numId w:val="1020"/>
+        </w:numPr>
+      </w:pPr>
+      <w:r>
+        <w:rPr>
+          <w:b/>
+          <w:bCs/>
+        </w:rPr>
+        <w:t xml:space="preserve">Transferability.</w:t>
+      </w:r>
+      <w:r>
+        <w:t xml:space="preserve"> </w:t>
+      </w:r>
+      <w:r>
+        <w:t xml:space="preserve">A model trained on Salvador should not be applied to other cities, including Indian cities, without retraining and validation on local data.</w:t>
+      </w:r>
+    </w:p>
+    <w:p>
+      <w:pPr>
+        <w:pStyle w:val="Compact"/>
+        <w:numPr>
+          <w:ilvl w:val="0"/>
+          <w:numId w:val="1020"/>
+        </w:numPr>
+      </w:pPr>
+      <w:r>
+        <w:rPr>
+          <w:b/>
+          <w:bCs/>
+        </w:rPr>
+        <w:t xml:space="preserve">Licensing and credit.</w:t>
+      </w:r>
+      <w:r>
+        <w:t xml:space="preserve"> </w:t>
+      </w:r>
+      <w:r>
+        <w:t xml:space="preserve">The data is used under CC BY 4.0 with attribution and a statement of changes. Repositories without a licence were read for ideas only and are cited, not copied.</w:t>
+      </w:r>
+    </w:p>
+    <w:p>
+      <w:pPr>
+        <w:pStyle w:val="Compact"/>
+        <w:numPr>
+          <w:ilvl w:val="0"/>
+          <w:numId w:val="1020"/>
+        </w:numPr>
+      </w:pPr>
+      <w:r>
+        <w:rPr>
+          <w:b/>
+          <w:bCs/>
+        </w:rPr>
+        <w:t xml:space="preserve">Use of AI assistance.</w:t>
+      </w:r>
+      <w:r>
+        <w:t xml:space="preserve"> </w:t>
+      </w:r>
+      <w:r>
+        <w:t xml:space="preserve">The code and documents in the repository, including this report, were written in AI-assisted sessions with Claude (Anthropic), directed and reviewed by the group lead. Every such commit carries a</w:t>
+      </w:r>
+      <w:r>
+        <w:t xml:space="preserve"> </w:t>
+      </w:r>
+      <w:r>
+        <w:rPr>
+          <w:rStyle w:val="VerbatimChar"/>
+        </w:rPr>
+        <w:t xml:space="preserve">Co-Authored-By</w:t>
+      </w:r>
+      <w:r>
+        <w:t xml:space="preserve"> </w:t>
+      </w:r>
+      <w:r>
+        <w:t xml:space="preserve">line; as of 24 October 2026 that is every commit. The team remains responsible for the content and must be able to explain it.</w:t>
       </w:r>
     </w:p>
     <w:bookmarkEnd w:id="91"/>
-    <w:bookmarkStart w:id="92" w:name="conclusion"/>
+    <w:bookmarkStart w:id="92" w:name="Xe3c24a0b61a45f5f1c7a8563dfd6b781e702cf6"/>
     <w:p>
       <w:pPr>
         <w:pStyle w:val="Heading1"/>
       </w:pPr>
       <w:r>
+        <w:t xml:space="preserve">12. Future work (proposed; none of this has been done)</w:t>
+      </w:r>
+    </w:p>
+    <w:p>
+      <w:pPr>
+        <w:pStyle w:val="Compact"/>
+        <w:numPr>
+          <w:ilvl w:val="0"/>
+          <w:numId w:val="1021"/>
+        </w:numPr>
+      </w:pPr>
+      <w:r>
+        <w:rPr>
+          <w:b/>
+          <w:bCs/>
+        </w:rPr>
+        <w:t xml:space="preserve">Per-period interval calibration:</w:t>
+      </w:r>
+      <w:r>
+        <w:t xml:space="preserve"> </w:t>
+      </w:r>
+      <w:r>
+        <w:t xml:space="preserve">a separate conformal margin for each period of the day, set on validation, to address the night-time gap (D13). Any new evaluation should use new held-out weeks.</w:t>
+      </w:r>
+    </w:p>
+    <w:p>
+      <w:pPr>
+        <w:pStyle w:val="Compact"/>
+        <w:numPr>
+          <w:ilvl w:val="0"/>
+          <w:numId w:val="1021"/>
+        </w:numPr>
+      </w:pPr>
+      <w:r>
+        <w:rPr>
+          <w:b/>
+          <w:bCs/>
+        </w:rPr>
+        <w:t xml:space="preserve">Fresh held-out data:</w:t>
+      </w:r>
+      <w:r>
+        <w:t xml:space="preserve"> </w:t>
+      </w:r>
+      <w:r>
+        <w:t xml:space="preserve">re-evaluate on later SUNT weeks (for example May 2024, if available at the pinned source) so that the final method is tested on weeks never seen before.</w:t>
+      </w:r>
+    </w:p>
+    <w:p>
+      <w:pPr>
+        <w:pStyle w:val="Compact"/>
+        <w:numPr>
+          <w:ilvl w:val="0"/>
+          <w:numId w:val="1021"/>
+        </w:numPr>
+      </w:pPr>
+      <w:r>
+        <w:rPr>
+          <w:b/>
+          <w:bCs/>
+        </w:rPr>
+        <w:t xml:space="preserve">Better inputs:</w:t>
+      </w:r>
+      <w:r>
+        <w:t xml:space="preserve"> </w:t>
+      </w:r>
+      <w:r>
+        <w:t xml:space="preserve">weather, events and holidays; timetable data for the study period, which would separate</w:t>
+      </w:r>
+      <w:r>
+        <w:t xml:space="preserve"> </w:t>
+      </w:r>
+      <w:r>
+        <w:t xml:space="preserve">“</w:t>
+      </w:r>
+      <w:r>
+        <w:t xml:space="preserve">no service</w:t>
+      </w:r>
+      <w:r>
+        <w:t xml:space="preserve">”</w:t>
+      </w:r>
+      <w:r>
+        <w:t xml:space="preserve"> </w:t>
+      </w:r>
+      <w:r>
+        <w:t xml:space="preserve">from</w:t>
+      </w:r>
+      <w:r>
+        <w:t xml:space="preserve"> </w:t>
+      </w:r>
+      <w:r>
+        <w:t xml:space="preserve">“</w:t>
+      </w:r>
+      <w:r>
+        <w:t xml:space="preserve">no record</w:t>
+      </w:r>
+      <w:r>
+        <w:t xml:space="preserve">”</w:t>
+      </w:r>
+      <w:r>
+        <w:t xml:space="preserve">.</w:t>
+      </w:r>
+    </w:p>
+    <w:p>
+      <w:pPr>
+        <w:pStyle w:val="Compact"/>
+        <w:numPr>
+          <w:ilvl w:val="0"/>
+          <w:numId w:val="1021"/>
+        </w:numPr>
+      </w:pPr>
+      <w:r>
+        <w:rPr>
+          <w:b/>
+          <w:bCs/>
+        </w:rPr>
+        <w:t xml:space="preserve">Real capacity and counts:</w:t>
+      </w:r>
+      <w:r>
+        <w:t xml:space="preserve"> </w:t>
+      </w:r>
+      <w:r>
+        <w:t xml:space="preserve">vehicle assignments per trip, or automatic passenger counters, to replace the assumed capacity and to validate the estimated load.</w:t>
+      </w:r>
+    </w:p>
+    <w:p>
+      <w:pPr>
+        <w:pStyle w:val="Compact"/>
+        <w:numPr>
+          <w:ilvl w:val="0"/>
+          <w:numId w:val="1021"/>
+        </w:numPr>
+      </w:pPr>
+      <w:r>
+        <w:rPr>
+          <w:b/>
+          <w:bCs/>
+        </w:rPr>
+        <w:t xml:space="preserve">Other cities:</w:t>
+      </w:r>
+      <w:r>
+        <w:t xml:space="preserve"> </w:t>
+      </w:r>
+      <w:r>
+        <w:t xml:space="preserve">test the pipeline on another open dataset with real counts, ideally from an Indian city, before making any claim beyond Salvador.</w:t>
+      </w:r>
+    </w:p>
+    <w:p>
+      <w:pPr>
+        <w:pStyle w:val="Compact"/>
+        <w:numPr>
+          <w:ilvl w:val="0"/>
+          <w:numId w:val="1021"/>
+        </w:numPr>
+      </w:pPr>
+      <w:r>
+        <w:rPr>
+          <w:b/>
+          <w:bCs/>
+        </w:rPr>
+        <w:t xml:space="preserve">Planning outputs:</w:t>
+      </w:r>
+      <w:r>
+        <w:t xml:space="preserve"> </w:t>
+      </w:r>
+      <w:r>
+        <w:t xml:space="preserve">an</w:t>
+      </w:r>
+      <w:r>
+        <w:t xml:space="preserve"> </w:t>
+      </w:r>
+      <w:r>
+        <w:t xml:space="preserve">“</w:t>
+      </w:r>
+      <w:r>
+        <w:t xml:space="preserve">extra trips needed</w:t>
+      </w:r>
+      <w:r>
+        <w:t xml:space="preserve">”</w:t>
+      </w:r>
+      <w:r>
+        <w:t xml:space="preserve"> </w:t>
+      </w:r>
+      <w:r>
+        <w:t xml:space="preserve">estimate under a stated capacity assumption (D5), shown as illustrative only.</w:t>
+      </w:r>
+    </w:p>
+    <w:p>
+      <w:pPr>
+        <w:pStyle w:val="Compact"/>
+        <w:numPr>
+          <w:ilvl w:val="0"/>
+          <w:numId w:val="1021"/>
+        </w:numPr>
+      </w:pPr>
+      <w:r>
+        <w:rPr>
+          <w:b/>
+          <w:bCs/>
+        </w:rPr>
+        <w:t xml:space="preserve">Lighter public hosting:</w:t>
+      </w:r>
+      <w:r>
+        <w:t xml:space="preserve"> </w:t>
+      </w:r>
+      <w:r>
+        <w:t xml:space="preserve">a server-side host (for example Streamlit Community Cloud, which needs its own account sign-in) would cut the first-visit download for viewers on slow networks.</w:t>
+      </w:r>
+    </w:p>
+    <w:bookmarkEnd w:id="92"/>
+    <w:bookmarkStart w:id="93" w:name="conclusion"/>
+    <w:p>
+      <w:pPr>
+        <w:pStyle w:val="Heading1"/>
+      </w:pPr>
+      <w:r>
         <w:t xml:space="preserve">13. Conclusion</w:t>
       </w:r>
     </w:p>
@@ -18054,7 +18558,7 @@
         <w:pStyle w:val="FirstParagraph"/>
       </w:pPr>
       <w:r>
-        <w:t xml:space="preserve">We built an end-to-end, reproducible system that forecasts day-ahead hourly boardings and estimated on-board load for every bus route-direction in Salvador, derives crowding levels under documented capacity assumptions, and presents the results in an offline dashboard. On two held-out weeks, the final forecast (an equal blend of LightGBM and a historical average) has a WAPE of 18.15% for demand and 19.20% for estimated load: about 23–24% better than the</w:t>
+        <w:t xml:space="preserve">We built an end-to-end, reproducible system that forecasts day-ahead hourly boardings and estimated on-board load for every bus route-direction in Salvador, derives crowding levels under documented capacity assumptions, and presents the results in a dashboard that runs offline on a laptop and publicly in any recent browser. On two held-out weeks, the final forecast (an equal blend of LightGBM and a historical average) has a WAPE of 18.15% for demand and 19.20% for estimated load: about 23–24% better than the</w:t>
       </w:r>
       <w:r>
         <w:t xml:space="preserve"> </w:t>
@@ -18083,8 +18587,8 @@
         <w:t xml:space="preserve">The most useful lesson is methodological. A strong, simple baseline captured almost all of the predictable structure, and only careful baselines, a validation-only selection protocol and a cluster bootstrap made that visible. We report the small gain, the second scoring of the test weeks, the dependence on an assumed capacity and the night-time interval gap as they are. Every number in this report can be traced to committed code, checked by automated tests and reproduced from a fresh clone.</w:t>
       </w:r>
     </w:p>
-    <w:bookmarkEnd w:id="92"/>
-    <w:bookmarkStart w:id="99" w:name="references"/>
+    <w:bookmarkEnd w:id="93"/>
+    <w:bookmarkStart w:id="100" w:name="references"/>
     <w:p>
       <w:pPr>
         <w:pStyle w:val="Heading1"/>
@@ -18100,7 +18604,7 @@
         <w:pStyle w:val="Compact"/>
         <w:numPr>
           <w:ilvl w:val="0"/>
-          <w:numId w:val="1017"/>
+          <w:numId w:val="1022"/>
         </w:numPr>
       </w:pPr>
       <w:r>
@@ -18122,7 +18626,7 @@
       <w:r>
         <w:t xml:space="preserve"> </w:t>
       </w:r>
-      <w:hyperlink r:id="rId93">
+      <w:hyperlink r:id="rId94">
         <w:r>
           <w:rPr>
             <w:rStyle w:val="Hyperlink"/>
@@ -18136,7 +18640,7 @@
         <w:pStyle w:val="Compact"/>
         <w:numPr>
           <w:ilvl w:val="0"/>
-          <w:numId w:val="1017"/>
+          <w:numId w:val="1022"/>
         </w:numPr>
       </w:pPr>
       <w:r>
@@ -18145,7 +18649,7 @@
       <w:r>
         <w:t xml:space="preserve"> </w:t>
       </w:r>
-      <w:hyperlink r:id="rId94">
+      <w:hyperlink r:id="rId95">
         <w:r>
           <w:rPr>
             <w:rStyle w:val="Hyperlink"/>
@@ -18165,7 +18669,7 @@
         <w:pStyle w:val="Compact"/>
         <w:numPr>
           <w:ilvl w:val="0"/>
-          <w:numId w:val="1017"/>
+          <w:numId w:val="1022"/>
         </w:numPr>
       </w:pPr>
       <w:r>
@@ -18186,7 +18690,7 @@
       <w:r>
         <w:t xml:space="preserve"> </w:t>
       </w:r>
-      <w:hyperlink r:id="rId95">
+      <w:hyperlink r:id="rId96">
         <w:r>
           <w:rPr>
             <w:rStyle w:val="Hyperlink"/>
@@ -18200,7 +18704,7 @@
         <w:pStyle w:val="Compact"/>
         <w:numPr>
           <w:ilvl w:val="0"/>
-          <w:numId w:val="1017"/>
+          <w:numId w:val="1022"/>
         </w:numPr>
       </w:pPr>
       <w:r>
@@ -18228,7 +18732,7 @@
         <w:pStyle w:val="Compact"/>
         <w:numPr>
           <w:ilvl w:val="0"/>
-          <w:numId w:val="1017"/>
+          <w:numId w:val="1022"/>
         </w:numPr>
       </w:pPr>
       <w:r>
@@ -18247,7 +18751,7 @@
       <w:r>
         <w:t xml:space="preserve"> </w:t>
       </w:r>
-      <w:hyperlink r:id="rId96">
+      <w:hyperlink r:id="rId97">
         <w:r>
           <w:rPr>
             <w:rStyle w:val="Hyperlink"/>
@@ -18261,7 +18765,7 @@
         <w:pStyle w:val="Compact"/>
         <w:numPr>
           <w:ilvl w:val="0"/>
-          <w:numId w:val="1017"/>
+          <w:numId w:val="1022"/>
         </w:numPr>
       </w:pPr>
       <w:r>
@@ -18286,7 +18790,7 @@
         <w:pStyle w:val="Compact"/>
         <w:numPr>
           <w:ilvl w:val="0"/>
-          <w:numId w:val="1017"/>
+          <w:numId w:val="1022"/>
         </w:numPr>
       </w:pPr>
       <w:r>
@@ -18311,7 +18815,7 @@
         <w:pStyle w:val="Compact"/>
         <w:numPr>
           <w:ilvl w:val="0"/>
-          <w:numId w:val="1017"/>
+          <w:numId w:val="1022"/>
         </w:numPr>
       </w:pPr>
       <w:r>
@@ -18336,7 +18840,7 @@
         <w:pStyle w:val="Compact"/>
         <w:numPr>
           <w:ilvl w:val="0"/>
-          <w:numId w:val="1017"/>
+          <w:numId w:val="1022"/>
         </w:numPr>
       </w:pPr>
       <w:r>
@@ -18364,7 +18868,7 @@
         <w:pStyle w:val="Compact"/>
         <w:numPr>
           <w:ilvl w:val="0"/>
-          <w:numId w:val="1017"/>
+          <w:numId w:val="1022"/>
         </w:numPr>
       </w:pPr>
       <w:r>
@@ -18385,7 +18889,7 @@
       <w:r>
         <w:t xml:space="preserve"> </w:t>
       </w:r>
-      <w:hyperlink r:id="rId97">
+      <w:hyperlink r:id="rId98">
         <w:r>
           <w:rPr>
             <w:rStyle w:val="Hyperlink"/>
@@ -18405,7 +18909,7 @@
         <w:pStyle w:val="Compact"/>
         <w:numPr>
           <w:ilvl w:val="0"/>
-          <w:numId w:val="1017"/>
+          <w:numId w:val="1022"/>
         </w:numPr>
       </w:pPr>
       <w:r>
@@ -18414,7 +18918,7 @@
       <w:r>
         <w:t xml:space="preserve"> </w:t>
       </w:r>
-      <w:hyperlink r:id="rId98">
+      <w:hyperlink r:id="rId99">
         <w:r>
           <w:rPr>
             <w:rStyle w:val="Hyperlink"/>
@@ -18429,8 +18933,8 @@
         <w:t xml:space="preserve">(read for ideas; no code copied).</w:t>
       </w:r>
     </w:p>
-    <w:bookmarkEnd w:id="99"/>
-    <w:bookmarkStart w:id="100" w:name="appendix-a.-team-and-contributions"/>
+    <w:bookmarkEnd w:id="100"/>
+    <w:bookmarkStart w:id="101" w:name="appendix-a.-team-and-contributions"/>
     <w:p>
       <w:pPr>
         <w:pStyle w:val="Heading1"/>
@@ -18499,8 +19003,8 @@
         <w:t xml:space="preserve">line. Teammates’ own reviews, runs and edits are to be committed from their own accounts, so that the Git history shows each contribution. This report does not claim individual contributions beyond what the repository records.</w:t>
       </w:r>
     </w:p>
-    <w:bookmarkEnd w:id="100"/>
-    <w:bookmarkStart w:id="101" w:name="appendix-b.-decision-log-index"/>
+    <w:bookmarkEnd w:id="101"/>
+    <w:bookmarkStart w:id="102" w:name="appendix-b.-decision-log-index"/>
     <w:p>
       <w:pPr>
         <w:pStyle w:val="Heading1"/>
@@ -19142,7 +19646,7 @@
         <w:t xml:space="preserve">in the repository.</w:t>
       </w:r>
     </w:p>
-    <w:bookmarkEnd w:id="101"/>
+    <w:bookmarkEnd w:id="102"/>
     <w:sectPr>
       <w:headerReference w:type="default" r:id="rId9"/>
       <w:footerReference w:type="default" r:id="rId10"/>
@@ -19655,6 +20159,21 @@
     </w:lvlOverride>
   </w:num>
   <w:num w:numId="1014">
+    <w:abstractNumId w:val="991"/>
+  </w:num>
+  <w:num w:numId="1015">
+    <w:abstractNumId w:val="991"/>
+  </w:num>
+  <w:num w:numId="1016">
+    <w:abstractNumId w:val="991"/>
+  </w:num>
+  <w:num w:numId="1017">
+    <w:abstractNumId w:val="991"/>
+  </w:num>
+  <w:num w:numId="1018">
+    <w:abstractNumId w:val="991"/>
+  </w:num>
+  <w:num w:numId="1019">
     <w:abstractNumId w:val="99411"/>
     <w:lvlOverride w:ilvl="0">
       <w:startOverride w:val="1"/>
@@ -19684,13 +20203,13 @@
       <w:startOverride w:val="1"/>
     </w:lvlOverride>
   </w:num>
-  <w:num w:numId="1015">
+  <w:num w:numId="1020">
     <w:abstractNumId w:val="991"/>
   </w:num>
-  <w:num w:numId="1016">
+  <w:num w:numId="1021">
     <w:abstractNumId w:val="991"/>
   </w:num>
-  <w:num w:numId="1017">
+  <w:num w:numId="1022">
     <w:abstractNumId w:val="99411"/>
     <w:lvlOverride w:ilvl="0">
       <w:startOverride w:val="1"/>

</xml_diff>